<commit_message>
Update cost_report.docx v3.0 - license/PC fixed, 80M price
</commit_message>
<xml_diff>
--- a/cost_report.docx
+++ b/cost_report.docx
@@ -48,7 +48,7 @@
           <w:sz w:val="19"/>
           <w:szCs w:val="19"/>
         </w:rPr>
-        <w:t xml:space="preserve">중소기업 투자 적정 수준 반영 (판매가 8,000만원 기준)</w:t>
+        <w:t xml:space="preserve">판매가 8,000만원 기준 원가 역산 (SW 라이선스·PC 사양 유지)</w:t>
       </w:r>
     </w:p>
     <w:tbl>
@@ -368,7 +368,7 @@
                 <w:sz w:val="19"/>
                 <w:szCs w:val="19"/>
               </w:rPr>
-              <w:t xml:space="preserve">80,000,000원 (사전 협의 수준 반영)</w:t>
+              <w:t xml:space="preserve">80,000,000원 (사전 협의 수준)</w:t>
             </w:r>
           </w:p>
         </w:tc>
@@ -399,6 +399,66 @@
                 <w:sz w:val="19"/>
                 <w:szCs w:val="19"/>
               </w:rPr>
+              <w:t xml:space="preserve">산출 조건</w:t>
+            </w:r>
+          </w:p>
+        </w:tc>
+        <w:tc>
+          <w:tcPr>
+            <w:tcW w:type="dxa" w:w="7552"/>
+            <w:tcMar>
+              <w:top w:type="dxa" w:w="40"/>
+              <w:left w:type="dxa" w:w="80"/>
+              <w:bottom w:type="dxa" w:w="40"/>
+              <w:right w:type="dxa" w:w="80"/>
+            </w:tcMar>
+            <w:vAlign w:val="center"/>
+          </w:tcPr>
+          <w:p>
+            <w:pPr>
+              <w:spacing w:after="0" w:before="0"/>
+              <w:jc w:val="left"/>
+            </w:pPr>
+            <w:r>
+              <w:rPr>
+                <w:rFonts w:ascii="맑은 고딕" w:cs="맑은 고딕" w:eastAsia="맑은 고딕" w:hAnsi="맑은 고딕"/>
+                <w:b w:val="false"/>
+                <w:bCs w:val="false"/>
+                <w:color w:val="2E2E2E"/>
+                <w:sz w:val="19"/>
+                <w:szCs w:val="19"/>
+              </w:rPr>
+              <w:t xml:space="preserve">SW 라이선스·PC 사양 유지 (감액 불가)</w:t>
+            </w:r>
+          </w:p>
+        </w:tc>
+      </w:tr>
+      <w:tr>
+        <w:tc>
+          <w:tcPr>
+            <w:tcW w:type="dxa" w:w="2200"/>
+            <w:tcMar>
+              <w:top w:type="dxa" w:w="40"/>
+              <w:left w:type="dxa" w:w="80"/>
+              <w:bottom w:type="dxa" w:w="40"/>
+              <w:right w:type="dxa" w:w="80"/>
+            </w:tcMar>
+            <w:vAlign w:val="center"/>
+          </w:tcPr>
+          <w:p>
+            <w:pPr>
+              <w:spacing w:after="0" w:before="0"/>
+              <w:jc w:val="left"/>
+            </w:pPr>
+            <w:r>
+              <w:rPr>
+                <w:rFonts w:ascii="맑은 고딕" w:cs="맑은 고딕" w:eastAsia="맑은 고딕" w:hAnsi="맑은 고딕"/>
+                <w:b w:val="false"/>
+                <w:bCs w:val="false"/>
+                <w:color w:val="2E2E2E"/>
+                <w:sz w:val="19"/>
+                <w:szCs w:val="19"/>
+              </w:rPr>
               <w:t xml:space="preserve">버전</w:t>
             </w:r>
           </w:p>
@@ -428,7 +488,7 @@
                 <w:sz w:val="19"/>
                 <w:szCs w:val="19"/>
               </w:rPr>
-              <w:t xml:space="preserve">v2.0 (v1.0 대비 원가 재산정)</w:t>
+              <w:t xml:space="preserve">v3.0</w:t>
             </w:r>
           </w:p>
         </w:tc>
@@ -452,7 +512,7 @@
           <w:sz w:val="24"/>
           <w:szCs w:val="24"/>
         </w:rPr>
-        <w:t xml:space="preserve">1. 산출 방침 — 무엇을 덜어냈는가</w:t>
+        <w:t xml:space="preserve">1. 산출 조건 및 제약</w:t>
       </w:r>
     </w:p>
     <w:p>
@@ -466,7 +526,7 @@
           <w:sz w:val="20"/>
           <w:szCs w:val="20"/>
         </w:rPr>
-        <w:t xml:space="preserve">1차 산출(v1.0) 결과는 총 원가 1억 4,539만원으로, 중소기업 설비 투자 관점에서 과도한 수준이었습니다. 실제 설비 구성(컨베어 직선 통과형, 단일 검사 스테이션, 반전·다축 기구 없음)에 맞춰 사양을 현실화하고, 과다 산정된 개발 공수를 재조정하였습니다.</w:t>
+        <w:t xml:space="preserve">사전 협의된 판매가 8,000만원을 기준으로 원가를 역산하였습니다. 딥러닝 SW 라이선스 및 PC 시스템은 검출 성능에 직결되는 핵심 요소이므로 사양을 유지하고, 나머지 항목에서 조정하였습니다.</w:t>
       </w:r>
     </w:p>
     <w:p>
@@ -487,7 +547,618 @@
           <w:sz w:val="21"/>
           <w:szCs w:val="21"/>
         </w:rPr>
-        <w:t xml:space="preserve">1-1. 항목별 조정 내역</w:t>
+        <w:t xml:space="preserve">1-1. 원가 역산 구조</w:t>
+      </w:r>
+    </w:p>
+    <w:tbl>
+      <w:tblPr>
+        <w:tblW w:type="dxa" w:w="9752"/>
+        <w:tblBorders>
+          <w:top w:val="single" w:color="A0B4D0" w:sz="6"/>
+          <w:left w:val="single" w:color="A0B4D0" w:sz="6"/>
+          <w:bottom w:val="single" w:color="A0B4D0" w:sz="6"/>
+          <w:right w:val="single" w:color="A0B4D0" w:sz="6"/>
+          <w:insideH w:val="single" w:color="auto" w:sz="4"/>
+          <w:insideV w:val="single" w:color="auto" w:sz="4"/>
+        </w:tblBorders>
+        <w:tblLayout w:type="fixed"/>
+      </w:tblPr>
+      <w:tblGrid>
+        <w:gridCol w:w="100"/>
+        <w:gridCol w:w="100"/>
+        <w:gridCol w:w="100"/>
+      </w:tblGrid>
+      <w:tr>
+        <w:trPr>
+          <w:tblHeader/>
+        </w:trPr>
+        <w:tc>
+          <w:tcPr>
+            <w:tcW w:type="dxa" w:w="3400"/>
+            <w:shd w:fill="D9E2F3" w:val="clear"/>
+            <w:tcMar>
+              <w:top w:type="dxa" w:w="40"/>
+              <w:left w:type="dxa" w:w="80"/>
+              <w:bottom w:type="dxa" w:w="40"/>
+              <w:right w:type="dxa" w:w="80"/>
+            </w:tcMar>
+            <w:vAlign w:val="center"/>
+          </w:tcPr>
+          <w:p>
+            <w:pPr>
+              <w:spacing w:after="0" w:before="0"/>
+              <w:jc w:val="center"/>
+            </w:pPr>
+            <w:r>
+              <w:rPr>
+                <w:rFonts w:ascii="맑은 고딕" w:cs="맑은 고딕" w:eastAsia="맑은 고딕" w:hAnsi="맑은 고딕"/>
+                <w:b/>
+                <w:bCs/>
+                <w:color w:val="1F3864"/>
+                <w:sz w:val="19"/>
+                <w:szCs w:val="19"/>
+              </w:rPr>
+              <w:t xml:space="preserve">구분</w:t>
+            </w:r>
+          </w:p>
+        </w:tc>
+        <w:tc>
+          <w:tcPr>
+            <w:tcW w:type="dxa" w:w="2600"/>
+            <w:shd w:fill="D9E2F3" w:val="clear"/>
+            <w:tcMar>
+              <w:top w:type="dxa" w:w="40"/>
+              <w:left w:type="dxa" w:w="80"/>
+              <w:bottom w:type="dxa" w:w="40"/>
+              <w:right w:type="dxa" w:w="80"/>
+            </w:tcMar>
+            <w:vAlign w:val="center"/>
+          </w:tcPr>
+          <w:p>
+            <w:pPr>
+              <w:spacing w:after="0" w:before="0"/>
+              <w:jc w:val="center"/>
+            </w:pPr>
+            <w:r>
+              <w:rPr>
+                <w:rFonts w:ascii="맑은 고딕" w:cs="맑은 고딕" w:eastAsia="맑은 고딕" w:hAnsi="맑은 고딕"/>
+                <w:b/>
+                <w:bCs/>
+                <w:color w:val="1F3864"/>
+                <w:sz w:val="19"/>
+                <w:szCs w:val="19"/>
+              </w:rPr>
+              <w:t xml:space="preserve">금액(원)</w:t>
+            </w:r>
+          </w:p>
+        </w:tc>
+        <w:tc>
+          <w:tcPr>
+            <w:tcW w:type="dxa" w:w="3752"/>
+            <w:shd w:fill="D9E2F3" w:val="clear"/>
+            <w:tcMar>
+              <w:top w:type="dxa" w:w="40"/>
+              <w:left w:type="dxa" w:w="80"/>
+              <w:bottom w:type="dxa" w:w="40"/>
+              <w:right w:type="dxa" w:w="80"/>
+            </w:tcMar>
+            <w:vAlign w:val="center"/>
+          </w:tcPr>
+          <w:p>
+            <w:pPr>
+              <w:spacing w:after="0" w:before="0"/>
+              <w:jc w:val="center"/>
+            </w:pPr>
+            <w:r>
+              <w:rPr>
+                <w:rFonts w:ascii="맑은 고딕" w:cs="맑은 고딕" w:eastAsia="맑은 고딕" w:hAnsi="맑은 고딕"/>
+                <w:b/>
+                <w:bCs/>
+                <w:color w:val="1F3864"/>
+                <w:sz w:val="19"/>
+                <w:szCs w:val="19"/>
+              </w:rPr>
+              <w:t xml:space="preserve">비고</w:t>
+            </w:r>
+          </w:p>
+        </w:tc>
+      </w:tr>
+      <w:tr>
+        <w:tc>
+          <w:tcPr>
+            <w:tcW w:type="dxa" w:w="3400"/>
+            <w:tcMar>
+              <w:top w:type="dxa" w:w="40"/>
+              <w:left w:type="dxa" w:w="80"/>
+              <w:bottom w:type="dxa" w:w="40"/>
+              <w:right w:type="dxa" w:w="80"/>
+            </w:tcMar>
+            <w:vAlign w:val="center"/>
+          </w:tcPr>
+          <w:p>
+            <w:pPr>
+              <w:spacing w:after="0" w:before="0"/>
+              <w:jc w:val="left"/>
+            </w:pPr>
+            <w:r>
+              <w:rPr>
+                <w:rFonts w:ascii="맑은 고딕" w:cs="맑은 고딕" w:eastAsia="맑은 고딕" w:hAnsi="맑은 고딕"/>
+                <w:b w:val="false"/>
+                <w:bCs w:val="false"/>
+                <w:color w:val="2E2E2E"/>
+                <w:sz w:val="19"/>
+                <w:szCs w:val="19"/>
+              </w:rPr>
+              <w:t xml:space="preserve">목표 판매가</w:t>
+            </w:r>
+          </w:p>
+        </w:tc>
+        <w:tc>
+          <w:tcPr>
+            <w:tcW w:type="dxa" w:w="2600"/>
+            <w:tcMar>
+              <w:top w:type="dxa" w:w="40"/>
+              <w:left w:type="dxa" w:w="80"/>
+              <w:bottom w:type="dxa" w:w="40"/>
+              <w:right w:type="dxa" w:w="80"/>
+            </w:tcMar>
+            <w:vAlign w:val="center"/>
+          </w:tcPr>
+          <w:p>
+            <w:pPr>
+              <w:spacing w:after="0" w:before="0"/>
+              <w:jc w:val="left"/>
+            </w:pPr>
+            <w:r>
+              <w:rPr>
+                <w:rFonts w:ascii="맑은 고딕" w:cs="맑은 고딕" w:eastAsia="맑은 고딕" w:hAnsi="맑은 고딕"/>
+                <w:b w:val="false"/>
+                <w:bCs w:val="false"/>
+                <w:color w:val="2E2E2E"/>
+                <w:sz w:val="19"/>
+                <w:szCs w:val="19"/>
+              </w:rPr>
+              <w:t xml:space="preserve">80,000,000</w:t>
+            </w:r>
+          </w:p>
+        </w:tc>
+        <w:tc>
+          <w:tcPr>
+            <w:tcW w:type="dxa" w:w="3752"/>
+            <w:tcMar>
+              <w:top w:type="dxa" w:w="40"/>
+              <w:left w:type="dxa" w:w="80"/>
+              <w:bottom w:type="dxa" w:w="40"/>
+              <w:right w:type="dxa" w:w="80"/>
+            </w:tcMar>
+            <w:vAlign w:val="center"/>
+          </w:tcPr>
+          <w:p>
+            <w:pPr>
+              <w:spacing w:after="0" w:before="0"/>
+              <w:jc w:val="right"/>
+            </w:pPr>
+            <w:r>
+              <w:rPr>
+                <w:rFonts w:ascii="맑은 고딕" w:cs="맑은 고딕" w:eastAsia="맑은 고딕" w:hAnsi="맑은 고딕"/>
+                <w:b w:val="false"/>
+                <w:bCs w:val="false"/>
+                <w:color w:val="2E2E2E"/>
+                <w:sz w:val="19"/>
+                <w:szCs w:val="19"/>
+              </w:rPr>
+              <w:t xml:space="preserve">사전 협의 수준</w:t>
+            </w:r>
+          </w:p>
+        </w:tc>
+      </w:tr>
+      <w:tr>
+        <w:tc>
+          <w:tcPr>
+            <w:tcW w:type="dxa" w:w="3400"/>
+            <w:tcMar>
+              <w:top w:type="dxa" w:w="40"/>
+              <w:left w:type="dxa" w:w="80"/>
+              <w:bottom w:type="dxa" w:w="40"/>
+              <w:right w:type="dxa" w:w="80"/>
+            </w:tcMar>
+            <w:vAlign w:val="center"/>
+          </w:tcPr>
+          <w:p>
+            <w:pPr>
+              <w:spacing w:after="0" w:before="0"/>
+              <w:jc w:val="left"/>
+            </w:pPr>
+            <w:r>
+              <w:rPr>
+                <w:rFonts w:ascii="맑은 고딕" w:cs="맑은 고딕" w:eastAsia="맑은 고딕" w:hAnsi="맑은 고딕"/>
+                <w:b w:val="false"/>
+                <w:bCs w:val="false"/>
+                <w:color w:val="2E2E2E"/>
+                <w:sz w:val="19"/>
+                <w:szCs w:val="19"/>
+              </w:rPr>
+              <w:t xml:space="preserve">적용 마진</w:t>
+            </w:r>
+          </w:p>
+        </w:tc>
+        <w:tc>
+          <w:tcPr>
+            <w:tcW w:type="dxa" w:w="2600"/>
+            <w:tcMar>
+              <w:top w:type="dxa" w:w="40"/>
+              <w:left w:type="dxa" w:w="80"/>
+              <w:bottom w:type="dxa" w:w="40"/>
+              <w:right w:type="dxa" w:w="80"/>
+            </w:tcMar>
+            <w:vAlign w:val="center"/>
+          </w:tcPr>
+          <w:p>
+            <w:pPr>
+              <w:spacing w:after="0" w:before="0"/>
+              <w:jc w:val="left"/>
+            </w:pPr>
+            <w:r>
+              <w:rPr>
+                <w:rFonts w:ascii="맑은 고딕" w:cs="맑은 고딕" w:eastAsia="맑은 고딕" w:hAnsi="맑은 고딕"/>
+                <w:b w:val="false"/>
+                <w:bCs w:val="false"/>
+                <w:color w:val="2E2E2E"/>
+                <w:sz w:val="19"/>
+                <w:szCs w:val="19"/>
+              </w:rPr>
+              <w:t xml:space="preserve">11,000,000</w:t>
+            </w:r>
+          </w:p>
+        </w:tc>
+        <w:tc>
+          <w:tcPr>
+            <w:tcW w:type="dxa" w:w="3752"/>
+            <w:tcMar>
+              <w:top w:type="dxa" w:w="40"/>
+              <w:left w:type="dxa" w:w="80"/>
+              <w:bottom w:type="dxa" w:w="40"/>
+              <w:right w:type="dxa" w:w="80"/>
+            </w:tcMar>
+            <w:vAlign w:val="center"/>
+          </w:tcPr>
+          <w:p>
+            <w:pPr>
+              <w:spacing w:after="0" w:before="0"/>
+              <w:jc w:val="right"/>
+            </w:pPr>
+            <w:r>
+              <w:rPr>
+                <w:rFonts w:ascii="맑은 고딕" w:cs="맑은 고딕" w:eastAsia="맑은 고딕" w:hAnsi="맑은 고딕"/>
+                <w:b w:val="false"/>
+                <w:bCs w:val="false"/>
+                <w:color w:val="2E2E2E"/>
+                <w:sz w:val="19"/>
+                <w:szCs w:val="19"/>
+              </w:rPr>
+              <w:t xml:space="preserve">13.8% (설비 사업 최소 수준)</w:t>
+            </w:r>
+          </w:p>
+        </w:tc>
+      </w:tr>
+      <w:tr>
+        <w:tc>
+          <w:tcPr>
+            <w:tcW w:type="dxa" w:w="3400"/>
+            <w:shd w:fill="EDF2FA" w:val="clear"/>
+            <w:tcMar>
+              <w:top w:type="dxa" w:w="40"/>
+              <w:left w:type="dxa" w:w="80"/>
+              <w:bottom w:type="dxa" w:w="40"/>
+              <w:right w:type="dxa" w:w="80"/>
+            </w:tcMar>
+            <w:vAlign w:val="center"/>
+          </w:tcPr>
+          <w:p>
+            <w:pPr>
+              <w:spacing w:after="0" w:before="0"/>
+              <w:jc w:val="left"/>
+            </w:pPr>
+            <w:r>
+              <w:rPr>
+                <w:rFonts w:ascii="맑은 고딕" w:cs="맑은 고딕" w:eastAsia="맑은 고딕" w:hAnsi="맑은 고딕"/>
+                <w:b/>
+                <w:bCs/>
+                <w:color w:val="1F3864"/>
+                <w:sz w:val="19"/>
+                <w:szCs w:val="19"/>
+              </w:rPr>
+              <w:t xml:space="preserve">가용 총원가</w:t>
+            </w:r>
+          </w:p>
+        </w:tc>
+        <w:tc>
+          <w:tcPr>
+            <w:tcW w:type="dxa" w:w="2600"/>
+            <w:shd w:fill="EDF2FA" w:val="clear"/>
+            <w:tcMar>
+              <w:top w:type="dxa" w:w="40"/>
+              <w:left w:type="dxa" w:w="80"/>
+              <w:bottom w:type="dxa" w:w="40"/>
+              <w:right w:type="dxa" w:w="80"/>
+            </w:tcMar>
+            <w:vAlign w:val="center"/>
+          </w:tcPr>
+          <w:p>
+            <w:pPr>
+              <w:spacing w:after="0" w:before="0"/>
+              <w:jc w:val="left"/>
+            </w:pPr>
+            <w:r>
+              <w:rPr>
+                <w:rFonts w:ascii="맑은 고딕" w:cs="맑은 고딕" w:eastAsia="맑은 고딕" w:hAnsi="맑은 고딕"/>
+                <w:b/>
+                <w:bCs/>
+                <w:color w:val="1F3864"/>
+                <w:sz w:val="19"/>
+                <w:szCs w:val="19"/>
+              </w:rPr>
+              <w:t xml:space="preserve">69,000,000</w:t>
+            </w:r>
+          </w:p>
+        </w:tc>
+        <w:tc>
+          <w:tcPr>
+            <w:tcW w:type="dxa" w:w="3752"/>
+            <w:shd w:fill="EDF2FA" w:val="clear"/>
+            <w:tcMar>
+              <w:top w:type="dxa" w:w="40"/>
+              <w:left w:type="dxa" w:w="80"/>
+              <w:bottom w:type="dxa" w:w="40"/>
+              <w:right w:type="dxa" w:w="80"/>
+            </w:tcMar>
+            <w:vAlign w:val="center"/>
+          </w:tcPr>
+          <w:p>
+            <w:pPr>
+              <w:spacing w:after="0" w:before="0"/>
+              <w:jc w:val="right"/>
+            </w:pPr>
+            <w:r>
+              <w:rPr>
+                <w:rFonts w:ascii="맑은 고딕" w:cs="맑은 고딕" w:eastAsia="맑은 고딕" w:hAnsi="맑은 고딕"/>
+                <w:b/>
+                <w:bCs/>
+                <w:color w:val="1F3864"/>
+                <w:sz w:val="19"/>
+                <w:szCs w:val="19"/>
+              </w:rPr>
+              <w:t xml:space="preserve"/>
+            </w:r>
+          </w:p>
+        </w:tc>
+      </w:tr>
+      <w:tr>
+        <w:tc>
+          <w:tcPr>
+            <w:tcW w:type="dxa" w:w="3400"/>
+            <w:shd w:fill="FEF9E7" w:val="clear"/>
+            <w:tcMar>
+              <w:top w:type="dxa" w:w="40"/>
+              <w:left w:type="dxa" w:w="80"/>
+              <w:bottom w:type="dxa" w:w="40"/>
+              <w:right w:type="dxa" w:w="80"/>
+            </w:tcMar>
+            <w:vAlign w:val="center"/>
+          </w:tcPr>
+          <w:p>
+            <w:pPr>
+              <w:spacing w:after="0" w:before="0"/>
+              <w:jc w:val="left"/>
+            </w:pPr>
+            <w:r>
+              <w:rPr>
+                <w:rFonts w:ascii="맑은 고딕" w:cs="맑은 고딕" w:eastAsia="맑은 고딕" w:hAnsi="맑은 고딕"/>
+                <w:b/>
+                <w:bCs/>
+                <w:color w:val="92400E"/>
+                <w:sz w:val="19"/>
+                <w:szCs w:val="19"/>
+              </w:rPr>
+              <w:t xml:space="preserve">SW 라이선스·PC (고정)</w:t>
+            </w:r>
+          </w:p>
+        </w:tc>
+        <w:tc>
+          <w:tcPr>
+            <w:tcW w:type="dxa" w:w="2600"/>
+            <w:shd w:fill="FEF9E7" w:val="clear"/>
+            <w:tcMar>
+              <w:top w:type="dxa" w:w="40"/>
+              <w:left w:type="dxa" w:w="80"/>
+              <w:bottom w:type="dxa" w:w="40"/>
+              <w:right w:type="dxa" w:w="80"/>
+            </w:tcMar>
+            <w:vAlign w:val="center"/>
+          </w:tcPr>
+          <w:p>
+            <w:pPr>
+              <w:spacing w:after="0" w:before="0"/>
+              <w:jc w:val="left"/>
+            </w:pPr>
+            <w:r>
+              <w:rPr>
+                <w:rFonts w:ascii="맑은 고딕" w:cs="맑은 고딕" w:eastAsia="맑은 고딕" w:hAnsi="맑은 고딕"/>
+                <w:b/>
+                <w:bCs/>
+                <w:color w:val="92400E"/>
+                <w:sz w:val="19"/>
+                <w:szCs w:val="19"/>
+              </w:rPr>
+              <w:t xml:space="preserve">35,000,000</w:t>
+            </w:r>
+          </w:p>
+        </w:tc>
+        <w:tc>
+          <w:tcPr>
+            <w:tcW w:type="dxa" w:w="3752"/>
+            <w:shd w:fill="FEF9E7" w:val="clear"/>
+            <w:tcMar>
+              <w:top w:type="dxa" w:w="40"/>
+              <w:left w:type="dxa" w:w="80"/>
+              <w:bottom w:type="dxa" w:w="40"/>
+              <w:right w:type="dxa" w:w="80"/>
+            </w:tcMar>
+            <w:vAlign w:val="center"/>
+          </w:tcPr>
+          <w:p>
+            <w:pPr>
+              <w:spacing w:after="0" w:before="0"/>
+              <w:jc w:val="right"/>
+            </w:pPr>
+            <w:r>
+              <w:rPr>
+                <w:rFonts w:ascii="맑은 고딕" w:cs="맑은 고딕" w:eastAsia="맑은 고딕" w:hAnsi="맑은 고딕"/>
+                <w:b/>
+                <w:bCs/>
+                <w:color w:val="92400E"/>
+                <w:sz w:val="19"/>
+                <w:szCs w:val="19"/>
+              </w:rPr>
+              <w:t xml:space="preserve">사양 유지 — 감액 불가</w:t>
+            </w:r>
+          </w:p>
+        </w:tc>
+      </w:tr>
+      <w:tr>
+        <w:tc>
+          <w:tcPr>
+            <w:tcW w:type="dxa" w:w="3400"/>
+            <w:shd w:fill="EDF2FA" w:val="clear"/>
+            <w:tcMar>
+              <w:top w:type="dxa" w:w="40"/>
+              <w:left w:type="dxa" w:w="80"/>
+              <w:bottom w:type="dxa" w:w="40"/>
+              <w:right w:type="dxa" w:w="80"/>
+            </w:tcMar>
+            <w:vAlign w:val="center"/>
+          </w:tcPr>
+          <w:p>
+            <w:pPr>
+              <w:spacing w:after="0" w:before="0"/>
+              <w:jc w:val="left"/>
+            </w:pPr>
+            <w:r>
+              <w:rPr>
+                <w:rFonts w:ascii="맑은 고딕" w:cs="맑은 고딕" w:eastAsia="맑은 고딕" w:hAnsi="맑은 고딕"/>
+                <w:b/>
+                <w:bCs/>
+                <w:color w:val="1F3864"/>
+                <w:sz w:val="19"/>
+                <w:szCs w:val="19"/>
+              </w:rPr>
+              <w:t xml:space="preserve">나머지 가용 예산</w:t>
+            </w:r>
+          </w:p>
+        </w:tc>
+        <w:tc>
+          <w:tcPr>
+            <w:tcW w:type="dxa" w:w="2600"/>
+            <w:shd w:fill="EDF2FA" w:val="clear"/>
+            <w:tcMar>
+              <w:top w:type="dxa" w:w="40"/>
+              <w:left w:type="dxa" w:w="80"/>
+              <w:bottom w:type="dxa" w:w="40"/>
+              <w:right w:type="dxa" w:w="80"/>
+            </w:tcMar>
+            <w:vAlign w:val="center"/>
+          </w:tcPr>
+          <w:p>
+            <w:pPr>
+              <w:spacing w:after="0" w:before="0"/>
+              <w:jc w:val="left"/>
+            </w:pPr>
+            <w:r>
+              <w:rPr>
+                <w:rFonts w:ascii="맑은 고딕" w:cs="맑은 고딕" w:eastAsia="맑은 고딕" w:hAnsi="맑은 고딕"/>
+                <w:b/>
+                <w:bCs/>
+                <w:color w:val="1F3864"/>
+                <w:sz w:val="19"/>
+                <w:szCs w:val="19"/>
+              </w:rPr>
+              <w:t xml:space="preserve">34,000,000</w:t>
+            </w:r>
+          </w:p>
+        </w:tc>
+        <w:tc>
+          <w:tcPr>
+            <w:tcW w:type="dxa" w:w="3752"/>
+            <w:shd w:fill="EDF2FA" w:val="clear"/>
+            <w:tcMar>
+              <w:top w:type="dxa" w:w="40"/>
+              <w:left w:type="dxa" w:w="80"/>
+              <w:bottom w:type="dxa" w:w="40"/>
+              <w:right w:type="dxa" w:w="80"/>
+            </w:tcMar>
+            <w:vAlign w:val="center"/>
+          </w:tcPr>
+          <w:p>
+            <w:pPr>
+              <w:spacing w:after="0" w:before="0"/>
+              <w:jc w:val="right"/>
+            </w:pPr>
+            <w:r>
+              <w:rPr>
+                <w:rFonts w:ascii="맑은 고딕" w:cs="맑은 고딕" w:eastAsia="맑은 고딕" w:hAnsi="맑은 고딕"/>
+                <w:b/>
+                <w:bCs/>
+                <w:color w:val="1F3864"/>
+                <w:sz w:val="19"/>
+                <w:szCs w:val="19"/>
+              </w:rPr>
+              <w:t xml:space="preserve">HW·기구·전장·인건비 전체</w:t>
+            </w:r>
+          </w:p>
+        </w:tc>
+      </w:tr>
+    </w:tbl>
+    <w:p>
+      <w:pPr>
+        <w:spacing w:after="0" w:before="0"/>
+      </w:pPr>
+    </w:p>
+    <w:p>
+      <w:pPr>
+        <w:spacing w:after="40" w:before="40"/>
+        <w:ind w:left="200"/>
+      </w:pPr>
+      <w:r>
+        <w:rPr>
+          <w:rFonts w:ascii="맑은 고딕" w:cs="맑은 고딕" w:eastAsia="맑은 고딕" w:hAnsi="맑은 고딕"/>
+          <w:b/>
+          <w:bCs/>
+          <w:color w:val="B91C1C"/>
+          <w:sz w:val="19"/>
+          <w:szCs w:val="19"/>
+        </w:rPr>
+        <w:t xml:space="preserve">※ SW·PC가 총원가의 50.7%를 차지하므로, 나머지 4개 항목을 3,400만원 내에 배분해야 하는 구조입니다.</w:t>
+      </w:r>
+    </w:p>
+    <w:p>
+      <w:pPr>
+        <w:spacing w:after="0" w:before="0"/>
+      </w:pPr>
+    </w:p>
+    <w:p>
+      <w:pPr>
+        <w:spacing w:after="50" w:before="140"/>
+      </w:pPr>
+      <w:r>
+        <w:rPr>
+          <w:rFonts w:ascii="맑은 고딕" w:cs="맑은 고딕" w:eastAsia="맑은 고딕" w:hAnsi="맑은 고딕"/>
+          <w:b/>
+          <w:bCs/>
+          <w:color w:val="2E4D8A"/>
+          <w:sz w:val="21"/>
+          <w:szCs w:val="21"/>
+        </w:rPr>
+        <w:t xml:space="preserve">1-2. 항목별 조정 결과 (v1.0 대비)</w:t>
       </w:r>
     </w:p>
     <w:tbl>
@@ -600,7 +1271,7 @@
                 <w:sz w:val="19"/>
                 <w:szCs w:val="19"/>
               </w:rPr>
-              <w:t xml:space="preserve">v2.0(원)</w:t>
+              <w:t xml:space="preserve">v3.0(원)</w:t>
             </w:r>
           </w:p>
         </w:tc>
@@ -630,7 +1301,7 @@
                 <w:sz w:val="19"/>
                 <w:szCs w:val="19"/>
               </w:rPr>
-              <w:t xml:space="preserve">절감액(원)</w:t>
+              <w:t xml:space="preserve">증감(원)</w:t>
             </w:r>
           </w:p>
         </w:tc>
@@ -660,7 +1331,7 @@
                 <w:sz w:val="19"/>
                 <w:szCs w:val="19"/>
               </w:rPr>
-              <w:t xml:space="preserve">조정 근거</w:t>
+              <w:t xml:space="preserve">조정 내용</w:t>
             </w:r>
           </w:p>
         </w:tc>
@@ -669,25 +1340,26 @@
         <w:tc>
           <w:tcPr>
             <w:tcW w:type="dxa" w:w="1900"/>
-            <w:tcMar>
-              <w:top w:type="dxa" w:w="40"/>
-              <w:left w:type="dxa" w:w="80"/>
-              <w:bottom w:type="dxa" w:w="40"/>
-              <w:right w:type="dxa" w:w="80"/>
-            </w:tcMar>
-            <w:vAlign w:val="center"/>
-          </w:tcPr>
-          <w:p>
-            <w:pPr>
-              <w:spacing w:after="0" w:before="0"/>
-              <w:jc w:val="left"/>
-            </w:pPr>
-            <w:r>
-              <w:rPr>
-                <w:rFonts w:ascii="맑은 고딕" w:cs="맑은 고딕" w:eastAsia="맑은 고딕" w:hAnsi="맑은 고딕"/>
-                <w:b w:val="false"/>
-                <w:bCs w:val="false"/>
-                <w:color w:val="2E2E2E"/>
+            <w:shd w:fill="FEF9E7" w:val="clear"/>
+            <w:tcMar>
+              <w:top w:type="dxa" w:w="40"/>
+              <w:left w:type="dxa" w:w="80"/>
+              <w:bottom w:type="dxa" w:w="40"/>
+              <w:right w:type="dxa" w:w="80"/>
+            </w:tcMar>
+            <w:vAlign w:val="center"/>
+          </w:tcPr>
+          <w:p>
+            <w:pPr>
+              <w:spacing w:after="0" w:before="0"/>
+              <w:jc w:val="left"/>
+            </w:pPr>
+            <w:r>
+              <w:rPr>
+                <w:rFonts w:ascii="맑은 고딕" w:cs="맑은 고딕" w:eastAsia="맑은 고딕" w:hAnsi="맑은 고딕"/>
+                <w:b/>
+                <w:bCs/>
+                <w:color w:val="92400E"/>
                 <w:sz w:val="19"/>
                 <w:szCs w:val="19"/>
               </w:rPr>
@@ -698,25 +1370,26 @@
         <w:tc>
           <w:tcPr>
             <w:tcW w:type="dxa" w:w="1900"/>
-            <w:tcMar>
-              <w:top w:type="dxa" w:w="40"/>
-              <w:left w:type="dxa" w:w="80"/>
-              <w:bottom w:type="dxa" w:w="40"/>
-              <w:right w:type="dxa" w:w="80"/>
-            </w:tcMar>
-            <w:vAlign w:val="center"/>
-          </w:tcPr>
-          <w:p>
-            <w:pPr>
-              <w:spacing w:after="0" w:before="0"/>
-              <w:jc w:val="left"/>
-            </w:pPr>
-            <w:r>
-              <w:rPr>
-                <w:rFonts w:ascii="맑은 고딕" w:cs="맑은 고딕" w:eastAsia="맑은 고딕" w:hAnsi="맑은 고딕"/>
-                <w:b w:val="false"/>
-                <w:bCs w:val="false"/>
-                <w:color w:val="2E2E2E"/>
+            <w:shd w:fill="FEF9E7" w:val="clear"/>
+            <w:tcMar>
+              <w:top w:type="dxa" w:w="40"/>
+              <w:left w:type="dxa" w:w="80"/>
+              <w:bottom w:type="dxa" w:w="40"/>
+              <w:right w:type="dxa" w:w="80"/>
+            </w:tcMar>
+            <w:vAlign w:val="center"/>
+          </w:tcPr>
+          <w:p>
+            <w:pPr>
+              <w:spacing w:after="0" w:before="0"/>
+              <w:jc w:val="left"/>
+            </w:pPr>
+            <w:r>
+              <w:rPr>
+                <w:rFonts w:ascii="맑은 고딕" w:cs="맑은 고딕" w:eastAsia="맑은 고딕" w:hAnsi="맑은 고딕"/>
+                <w:b/>
+                <w:bCs/>
+                <w:color w:val="92400E"/>
                 <w:sz w:val="19"/>
                 <w:szCs w:val="19"/>
               </w:rPr>
@@ -727,87 +1400,90 @@
         <w:tc>
           <w:tcPr>
             <w:tcW w:type="dxa" w:w="1900"/>
-            <w:tcMar>
-              <w:top w:type="dxa" w:w="40"/>
-              <w:left w:type="dxa" w:w="80"/>
-              <w:bottom w:type="dxa" w:w="40"/>
-              <w:right w:type="dxa" w:w="80"/>
-            </w:tcMar>
-            <w:vAlign w:val="center"/>
-          </w:tcPr>
-          <w:p>
-            <w:pPr>
-              <w:spacing w:after="0" w:before="0"/>
-              <w:jc w:val="right"/>
-            </w:pPr>
-            <w:r>
-              <w:rPr>
-                <w:rFonts w:ascii="맑은 고딕" w:cs="맑은 고딕" w:eastAsia="맑은 고딕" w:hAnsi="맑은 고딕"/>
-                <w:b w:val="false"/>
-                <w:bCs w:val="false"/>
-                <w:color w:val="2E2E2E"/>
-                <w:sz w:val="19"/>
-                <w:szCs w:val="19"/>
-              </w:rPr>
-              <w:t xml:space="preserve">14,500,000</w:t>
+            <w:shd w:fill="FEF9E7" w:val="clear"/>
+            <w:tcMar>
+              <w:top w:type="dxa" w:w="40"/>
+              <w:left w:type="dxa" w:w="80"/>
+              <w:bottom w:type="dxa" w:w="40"/>
+              <w:right w:type="dxa" w:w="80"/>
+            </w:tcMar>
+            <w:vAlign w:val="center"/>
+          </w:tcPr>
+          <w:p>
+            <w:pPr>
+              <w:spacing w:after="0" w:before="0"/>
+              <w:jc w:val="right"/>
+            </w:pPr>
+            <w:r>
+              <w:rPr>
+                <w:rFonts w:ascii="맑은 고딕" w:cs="맑은 고딕" w:eastAsia="맑은 고딕" w:hAnsi="맑은 고딕"/>
+                <w:b/>
+                <w:bCs/>
+                <w:color w:val="92400E"/>
+                <w:sz w:val="19"/>
+                <w:szCs w:val="19"/>
+              </w:rPr>
+              <w:t xml:space="preserve">35,000,000</w:t>
             </w:r>
           </w:p>
         </w:tc>
         <w:tc>
           <w:tcPr>
             <w:tcW w:type="dxa" w:w="1900"/>
-            <w:tcMar>
-              <w:top w:type="dxa" w:w="40"/>
-              <w:left w:type="dxa" w:w="80"/>
-              <w:bottom w:type="dxa" w:w="40"/>
-              <w:right w:type="dxa" w:w="80"/>
-            </w:tcMar>
-            <w:vAlign w:val="center"/>
-          </w:tcPr>
-          <w:p>
-            <w:pPr>
-              <w:spacing w:after="0" w:before="0"/>
-              <w:jc w:val="right"/>
-            </w:pPr>
-            <w:r>
-              <w:rPr>
-                <w:rFonts w:ascii="맑은 고딕" w:cs="맑은 고딕" w:eastAsia="맑은 고딕" w:hAnsi="맑은 고딕"/>
-                <w:b w:val="false"/>
-                <w:bCs w:val="false"/>
-                <w:color w:val="2E2E2E"/>
-                <w:sz w:val="19"/>
-                <w:szCs w:val="19"/>
-              </w:rPr>
-              <w:t xml:space="preserve">20,500,000</w:t>
+            <w:shd w:fill="FEF9E7" w:val="clear"/>
+            <w:tcMar>
+              <w:top w:type="dxa" w:w="40"/>
+              <w:left w:type="dxa" w:w="80"/>
+              <w:bottom w:type="dxa" w:w="40"/>
+              <w:right w:type="dxa" w:w="80"/>
+            </w:tcMar>
+            <w:vAlign w:val="center"/>
+          </w:tcPr>
+          <w:p>
+            <w:pPr>
+              <w:spacing w:after="0" w:before="0"/>
+              <w:jc w:val="right"/>
+            </w:pPr>
+            <w:r>
+              <w:rPr>
+                <w:rFonts w:ascii="맑은 고딕" w:cs="맑은 고딕" w:eastAsia="맑은 고딕" w:hAnsi="맑은 고딕"/>
+                <w:b/>
+                <w:bCs/>
+                <w:color w:val="92400E"/>
+                <w:sz w:val="19"/>
+                <w:szCs w:val="19"/>
+              </w:rPr>
+              <w:t xml:space="preserve">0</w:t>
             </w:r>
           </w:p>
         </w:tc>
         <w:tc>
           <w:tcPr>
             <w:tcW w:type="dxa" w:w="2152"/>
-            <w:tcMar>
-              <w:top w:type="dxa" w:w="40"/>
-              <w:left w:type="dxa" w:w="80"/>
-              <w:bottom w:type="dxa" w:w="40"/>
-              <w:right w:type="dxa" w:w="80"/>
-            </w:tcMar>
-            <w:vAlign w:val="center"/>
-          </w:tcPr>
-          <w:p>
-            <w:pPr>
-              <w:spacing w:after="0" w:before="0"/>
-              <w:jc w:val="right"/>
-            </w:pPr>
-            <w:r>
-              <w:rPr>
-                <w:rFonts w:ascii="맑은 고딕" w:cs="맑은 고딕" w:eastAsia="맑은 고딕" w:hAnsi="맑은 고딕"/>
-                <w:b w:val="false"/>
-                <w:bCs w:val="false"/>
-                <w:color w:val="2E2E2E"/>
-                <w:sz w:val="19"/>
-                <w:szCs w:val="19"/>
-              </w:rPr>
-              <w:t xml:space="preserve">최상위→중급 등급, 보급형 GPU</w:t>
+            <w:shd w:fill="FEF9E7" w:val="clear"/>
+            <w:tcMar>
+              <w:top w:type="dxa" w:w="40"/>
+              <w:left w:type="dxa" w:w="80"/>
+              <w:bottom w:type="dxa" w:w="40"/>
+              <w:right w:type="dxa" w:w="80"/>
+            </w:tcMar>
+            <w:vAlign w:val="center"/>
+          </w:tcPr>
+          <w:p>
+            <w:pPr>
+              <w:spacing w:after="0" w:before="0"/>
+              <w:jc w:val="right"/>
+            </w:pPr>
+            <w:r>
+              <w:rPr>
+                <w:rFonts w:ascii="맑은 고딕" w:cs="맑은 고딕" w:eastAsia="맑은 고딕" w:hAnsi="맑은 고딕"/>
+                <w:b/>
+                <w:bCs/>
+                <w:color w:val="92400E"/>
+                <w:sz w:val="19"/>
+                <w:szCs w:val="19"/>
+              </w:rPr>
+              <w:t xml:space="preserve">사양 유지</w:t>
             </w:r>
           </w:p>
         </w:tc>
@@ -896,7 +1572,7 @@
                 <w:sz w:val="19"/>
                 <w:szCs w:val="19"/>
               </w:rPr>
-              <w:t xml:space="preserve">7,500,000</w:t>
+              <w:t xml:space="preserve">7,000,000</w:t>
             </w:r>
           </w:p>
         </w:tc>
@@ -925,7 +1601,7 @@
                 <w:sz w:val="19"/>
                 <w:szCs w:val="19"/>
               </w:rPr>
-              <w:t xml:space="preserve">3,700,000</w:t>
+              <w:t xml:space="preserve">-4,200,000</w:t>
             </w:r>
           </w:p>
         </w:tc>
@@ -1043,7 +1719,7 @@
                 <w:sz w:val="19"/>
                 <w:szCs w:val="19"/>
               </w:rPr>
-              <w:t xml:space="preserve">13,000,000</w:t>
+              <w:t xml:space="preserve">10,500,000</w:t>
             </w:r>
           </w:p>
         </w:tc>
@@ -1072,7 +1748,7 @@
                 <w:sz w:val="19"/>
                 <w:szCs w:val="19"/>
               </w:rPr>
-              <w:t xml:space="preserve">9,000,000</w:t>
+              <w:t xml:space="preserve">-11,500,000</w:t>
             </w:r>
           </w:p>
         </w:tc>
@@ -1101,7 +1777,7 @@
                 <w:sz w:val="19"/>
                 <w:szCs w:val="19"/>
               </w:rPr>
-              <w:t xml:space="preserve">단순 통과형 구조 반영</w:t>
+              <w:t xml:space="preserve">단순 통과형, 표준품 활용</w:t>
             </w:r>
           </w:p>
         </w:tc>
@@ -1190,7 +1866,7 @@
                 <w:sz w:val="19"/>
                 <w:szCs w:val="19"/>
               </w:rPr>
-              <w:t xml:space="preserve">6,500,000</w:t>
+              <w:t xml:space="preserve">5,300,000</w:t>
             </w:r>
           </w:p>
         </w:tc>
@@ -1219,7 +1895,7 @@
                 <w:sz w:val="19"/>
                 <w:szCs w:val="19"/>
               </w:rPr>
-              <w:t xml:space="preserve">2,500,000</w:t>
+              <w:t xml:space="preserve">-3,700,000</w:t>
             </w:r>
           </w:p>
         </w:tc>
@@ -1248,7 +1924,7 @@
                 <w:sz w:val="19"/>
                 <w:szCs w:val="19"/>
               </w:rPr>
-              <w:t xml:space="preserve">제어 축수 축소</w:t>
+              <w:t xml:space="preserve">제어 1축 구성</w:t>
             </w:r>
           </w:p>
         </w:tc>
@@ -1337,7 +2013,7 @@
                 <w:sz w:val="19"/>
                 <w:szCs w:val="19"/>
               </w:rPr>
-              <w:t xml:space="preserve">21,500,000</w:t>
+              <w:t xml:space="preserve">10,400,000</w:t>
             </w:r>
           </w:p>
         </w:tc>
@@ -1366,7 +2042,7 @@
                 <w:sz w:val="19"/>
                 <w:szCs w:val="19"/>
               </w:rPr>
-              <w:t xml:space="preserve">39,770,000</w:t>
+              <w:t xml:space="preserve">-50,870,000</w:t>
             </w:r>
           </w:p>
         </w:tc>
@@ -1395,7 +2071,7 @@
                 <w:sz w:val="19"/>
                 <w:szCs w:val="19"/>
               </w:rPr>
-              <w:t xml:space="preserve">150 M/D → 60 M/D</w:t>
+              <w:t xml:space="preserve">150 M/D → 29 M/D</w:t>
             </w:r>
           </w:p>
         </w:tc>
@@ -1484,7 +2160,7 @@
                 <w:sz w:val="19"/>
                 <w:szCs w:val="19"/>
               </w:rPr>
-              <w:t xml:space="preserve">2,000,000</w:t>
+              <w:t xml:space="preserve">800,000</w:t>
             </w:r>
           </w:p>
         </w:tc>
@@ -1513,7 +2189,7 @@
                 <w:sz w:val="19"/>
                 <w:szCs w:val="19"/>
               </w:rPr>
-              <w:t xml:space="preserve">4,923,500</w:t>
+              <w:t xml:space="preserve">-6,123,500</w:t>
             </w:r>
           </w:p>
         </w:tc>
@@ -1542,7 +2218,7 @@
                 <w:sz w:val="19"/>
                 <w:szCs w:val="19"/>
               </w:rPr>
-              <w:t xml:space="preserve">5%→3% 축소</w:t>
+              <w:t xml:space="preserve">1.2% 수준</w:t>
             </w:r>
           </w:p>
         </w:tc>
@@ -1634,7 +2310,7 @@
                 <w:sz w:val="19"/>
                 <w:szCs w:val="19"/>
               </w:rPr>
-              <w:t xml:space="preserve">65,000,000</w:t>
+              <w:t xml:space="preserve">69,000,000</w:t>
             </w:r>
           </w:p>
         </w:tc>
@@ -1664,7 +2340,7 @@
                 <w:sz w:val="19"/>
                 <w:szCs w:val="19"/>
               </w:rPr>
-              <w:t xml:space="preserve">80,393,500</w:t>
+              <w:t xml:space="preserve">-76,393,500</w:t>
             </w:r>
           </w:p>
         </w:tc>
@@ -1694,226 +2370,12 @@
                 <w:sz w:val="19"/>
                 <w:szCs w:val="19"/>
               </w:rPr>
-              <w:t xml:space="preserve">약 55% 절감</w:t>
+              <w:t xml:space="preserve">약 53% 절감</w:t>
             </w:r>
           </w:p>
         </w:tc>
       </w:tr>
     </w:tbl>
-    <w:p>
-      <w:pPr>
-        <w:spacing w:after="0" w:before="0"/>
-      </w:pPr>
-    </w:p>
-    <w:p>
-      <w:pPr>
-        <w:spacing w:after="50" w:before="140"/>
-      </w:pPr>
-      <w:r>
-        <w:rPr>
-          <w:rFonts w:ascii="맑은 고딕" w:cs="맑은 고딕" w:eastAsia="맑은 고딕" w:hAnsi="맑은 고딕"/>
-          <w:b/>
-          <w:bCs/>
-          <w:color w:val="2E4D8A"/>
-          <w:sz w:val="21"/>
-          <w:szCs w:val="21"/>
-        </w:rPr>
-        <w:t xml:space="preserve">1-2. 주요 절감 사유 상세</w:t>
-      </w:r>
-    </w:p>
-    <w:p>
-      <w:pPr>
-        <w:spacing w:after="30" w:before="30"/>
-      </w:pPr>
-      <w:r>
-        <w:rPr>
-          <w:rFonts w:ascii="맑은 고딕" w:cs="맑은 고딕" w:eastAsia="맑은 고딕" w:hAnsi="맑은 고딕"/>
-          <w:b/>
-          <w:bCs/>
-          <w:color w:val="B91C1C"/>
-          <w:sz w:val="20"/>
-          <w:szCs w:val="20"/>
-        </w:rPr>
-        <w:t xml:space="preserve">개발 인건비 (150 M/D → 60 M/D)</w:t>
-      </w:r>
-    </w:p>
-    <w:p>
-      <w:pPr>
-        <w:spacing w:after="20" w:before="20"/>
-        <w:ind w:left="280"/>
-      </w:pPr>
-      <w:r>
-        <w:rPr>
-          <w:rFonts w:ascii="맑은 고딕" w:cs="맑은 고딕" w:eastAsia="맑은 고딕" w:hAnsi="맑은 고딕"/>
-          <w:color w:val="2E2E2E"/>
-          <w:sz w:val="20"/>
-          <w:szCs w:val="20"/>
-        </w:rPr>
-        <w:t xml:space="preserve">· 본 설비는 컨베어 직선 통과형으로 로봇·다축 모션·반전 기구가 없어 기구·제어 설계 난이도가 낮음</w:t>
-      </w:r>
-    </w:p>
-    <w:p>
-      <w:pPr>
-        <w:spacing w:after="20" w:before="20"/>
-        <w:ind w:left="280"/>
-      </w:pPr>
-      <w:r>
-        <w:rPr>
-          <w:rFonts w:ascii="맑은 고딕" w:cs="맑은 고딕" w:eastAsia="맑은 고딕" w:hAnsi="맑은 고딕"/>
-          <w:color w:val="2E2E2E"/>
-          <w:sz w:val="20"/>
-          <w:szCs w:val="20"/>
-        </w:rPr>
-        <w:t xml:space="preserve">· 검사 항목이 PCB 외관 불량 5종(실장·납땜·누락·극성·이물)으로 한정되어 모델 개발 범위가 명확함</w:t>
-      </w:r>
-    </w:p>
-    <w:p>
-      <w:pPr>
-        <w:spacing w:after="20" w:before="20"/>
-        <w:ind w:left="280"/>
-      </w:pPr>
-      <w:r>
-        <w:rPr>
-          <w:rFonts w:ascii="맑은 고딕" w:cs="맑은 고딕" w:eastAsia="맑은 고딕" w:hAnsi="맑은 고딕"/>
-          <w:color w:val="2E2E2E"/>
-          <w:sz w:val="20"/>
-          <w:szCs w:val="20"/>
-        </w:rPr>
-        <w:t xml:space="preserve">· PM 15일 → 5일: 단일 설비 프로젝트에 전담 PM 장기 투입은 불필요, 센터장 직접 관리로 대체</w:t>
-      </w:r>
-    </w:p>
-    <w:p>
-      <w:pPr>
-        <w:spacing w:after="0" w:before="0"/>
-      </w:pPr>
-    </w:p>
-    <w:p>
-      <w:pPr>
-        <w:spacing w:after="30" w:before="30"/>
-      </w:pPr>
-      <w:r>
-        <w:rPr>
-          <w:rFonts w:ascii="맑은 고딕" w:cs="맑은 고딕" w:eastAsia="맑은 고딕" w:hAnsi="맑은 고딕"/>
-          <w:b/>
-          <w:bCs/>
-          <w:color w:val="B91C1C"/>
-          <w:sz w:val="20"/>
-          <w:szCs w:val="20"/>
-        </w:rPr>
-        <w:t xml:space="preserve">SW 라이선스 (2,900만원 → 1,000만원)</w:t>
-      </w:r>
-    </w:p>
-    <w:p>
-      <w:pPr>
-        <w:spacing w:after="20" w:before="20"/>
-        <w:ind w:left="280"/>
-      </w:pPr>
-      <w:r>
-        <w:rPr>
-          <w:rFonts w:ascii="맑은 고딕" w:cs="맑은 고딕" w:eastAsia="맑은 고딕" w:hAnsi="맑은 고딕"/>
-          <w:color w:val="2E2E2E"/>
-          <w:sz w:val="20"/>
-          <w:szCs w:val="20"/>
-        </w:rPr>
-        <w:t xml:space="preserve">· 최상위 풀패키지가 아닌 결함 검출(Analyze) 기능 중심의 중급 등급으로 충분</w:t>
-      </w:r>
-    </w:p>
-    <w:p>
-      <w:pPr>
-        <w:spacing w:after="20" w:before="20"/>
-        <w:ind w:left="280"/>
-      </w:pPr>
-      <w:r>
-        <w:rPr>
-          <w:rFonts w:ascii="맑은 고딕" w:cs="맑은 고딕" w:eastAsia="맑은 고딕" w:hAnsi="맑은 고딕"/>
-          <w:color w:val="2E2E2E"/>
-          <w:sz w:val="20"/>
-          <w:szCs w:val="20"/>
-        </w:rPr>
-        <w:t xml:space="preserve">· 개발 라이선스 1식 + 런타임 1식 구성으로 최소화</w:t>
-      </w:r>
-    </w:p>
-    <w:p>
-      <w:pPr>
-        <w:spacing w:after="20" w:before="20"/>
-        <w:ind w:left="280"/>
-      </w:pPr>
-      <w:r>
-        <w:rPr>
-          <w:rFonts w:ascii="맑은 고딕" w:cs="맑은 고딕" w:eastAsia="맑은 고딕" w:hAnsi="맑은 고딕"/>
-          <w:color w:val="2E2E2E"/>
-          <w:sz w:val="20"/>
-          <w:szCs w:val="20"/>
-        </w:rPr>
-        <w:t xml:space="preserve">· 오픈소스 프레임워크 병용 시 추가 절감 가능(별도 검토)</w:t>
-      </w:r>
-    </w:p>
-    <w:p>
-      <w:pPr>
-        <w:spacing w:after="0" w:before="0"/>
-      </w:pPr>
-    </w:p>
-    <w:p>
-      <w:pPr>
-        <w:spacing w:after="30" w:before="30"/>
-      </w:pPr>
-      <w:r>
-        <w:rPr>
-          <w:rFonts w:ascii="맑은 고딕" w:cs="맑은 고딕" w:eastAsia="맑은 고딕" w:hAnsi="맑은 고딕"/>
-          <w:b/>
-          <w:bCs/>
-          <w:color w:val="B91C1C"/>
-          <w:sz w:val="20"/>
-          <w:szCs w:val="20"/>
-        </w:rPr>
-        <w:t xml:space="preserve">기구·모션 (2,200만원 → 1,300만원)</w:t>
-      </w:r>
-    </w:p>
-    <w:p>
-      <w:pPr>
-        <w:spacing w:after="20" w:before="20"/>
-        <w:ind w:left="280"/>
-      </w:pPr>
-      <w:r>
-        <w:rPr>
-          <w:rFonts w:ascii="맑은 고딕" w:cs="맑은 고딕" w:eastAsia="맑은 고딕" w:hAnsi="맑은 고딕"/>
-          <w:color w:val="2E2E2E"/>
-          <w:sz w:val="20"/>
-          <w:szCs w:val="20"/>
-        </w:rPr>
-        <w:t xml:space="preserve">· 컨베어 폭 100mm, 직선 이송 구조로 표준 부품 활용 가능</w:t>
-      </w:r>
-    </w:p>
-    <w:p>
-      <w:pPr>
-        <w:spacing w:after="20" w:before="20"/>
-        <w:ind w:left="280"/>
-      </w:pPr>
-      <w:r>
-        <w:rPr>
-          <w:rFonts w:ascii="맑은 고딕" w:cs="맑은 고딕" w:eastAsia="맑은 고딕" w:hAnsi="맑은 고딕"/>
-          <w:color w:val="2E2E2E"/>
-          <w:sz w:val="20"/>
-          <w:szCs w:val="20"/>
-        </w:rPr>
-        <w:t xml:space="preserve">· 검사 지그는 단순 정위치 고정형(가이드 + 스토퍼)으로 설계 단순화</w:t>
-      </w:r>
-    </w:p>
-    <w:p>
-      <w:pPr>
-        <w:spacing w:after="20" w:before="20"/>
-        <w:ind w:left="280"/>
-      </w:pPr>
-      <w:r>
-        <w:rPr>
-          <w:rFonts w:ascii="맑은 고딕" w:cs="맑은 고딕" w:eastAsia="맑은 고딕" w:hAnsi="맑은 고딕"/>
-          <w:color w:val="2E2E2E"/>
-          <w:sz w:val="20"/>
-          <w:szCs w:val="20"/>
-        </w:rPr>
-        <w:t xml:space="preserve">· 양불 분리는 푸셔 1축 + 슈터 구조로 최소 구성</w:t>
-      </w:r>
-    </w:p>
     <w:p>
       <w:pPr>
         <w:spacing w:after="0" w:before="0"/>
@@ -1932,7 +2394,7 @@
           <w:sz w:val="24"/>
           <w:szCs w:val="24"/>
         </w:rPr>
-        <w:t xml:space="preserve">2. 재산정 원가 내역</w:t>
+        <w:t xml:space="preserve">2. 원가 내역</w:t>
       </w:r>
     </w:p>
     <w:p>
@@ -1948,7 +2410,7 @@
           <w:sz w:val="21"/>
           <w:szCs w:val="21"/>
         </w:rPr>
-        <w:t xml:space="preserve">2-1. SW 라이선스 및 PC 시스템</w:t>
+        <w:t xml:space="preserve">2-1. SW 라이선스 및 PC 시스템 (사양 유지)</w:t>
       </w:r>
     </w:p>
     <w:tbl>
@@ -2181,7 +2643,7 @@
                 <w:sz w:val="19"/>
                 <w:szCs w:val="19"/>
               </w:rPr>
-              <w:t xml:space="preserve">결함 검출 중급 등급 (개발용)</w:t>
+              <w:t xml:space="preserve">Cognex ViDi / MVTec HALCON 급</w:t>
             </w:r>
           </w:p>
         </w:tc>
@@ -2239,7 +2701,7 @@
                 <w:sz w:val="19"/>
                 <w:szCs w:val="19"/>
               </w:rPr>
-              <w:t xml:space="preserve">7,000,000</w:t>
+              <w:t xml:space="preserve">25,000,000</w:t>
             </w:r>
           </w:p>
         </w:tc>
@@ -2268,7 +2730,7 @@
                 <w:sz w:val="19"/>
                 <w:szCs w:val="19"/>
               </w:rPr>
-              <w:t xml:space="preserve">7,000,000</w:t>
+              <w:t xml:space="preserve">25,000,000</w:t>
             </w:r>
           </w:p>
         </w:tc>
@@ -2386,7 +2848,7 @@
                 <w:sz w:val="19"/>
                 <w:szCs w:val="19"/>
               </w:rPr>
-              <w:t xml:space="preserve">3,000,000</w:t>
+              <w:t xml:space="preserve">4,000,000</w:t>
             </w:r>
           </w:p>
         </w:tc>
@@ -2415,7 +2877,7 @@
                 <w:sz w:val="19"/>
                 <w:szCs w:val="19"/>
               </w:rPr>
-              <w:t xml:space="preserve">3,000,000</w:t>
+              <w:t xml:space="preserve">4,000,000</w:t>
             </w:r>
           </w:p>
         </w:tc>
@@ -2446,7 +2908,7 @@
                 <w:sz w:val="19"/>
                 <w:szCs w:val="19"/>
               </w:rPr>
-              <w:t xml:space="preserve">산업용 PC (GPU 탑재)</w:t>
+              <w:t xml:space="preserve">GPU 산업용 PC</w:t>
             </w:r>
           </w:p>
         </w:tc>
@@ -2475,7 +2937,7 @@
                 <w:sz w:val="19"/>
                 <w:szCs w:val="19"/>
               </w:rPr>
-              <w:t xml:space="preserve">i5급 + RTX 4060 급</w:t>
+              <w:t xml:space="preserve">i7급 + RTX A2000/4060 급</w:t>
             </w:r>
           </w:p>
         </w:tc>
@@ -2533,7 +2995,7 @@
                 <w:sz w:val="19"/>
                 <w:szCs w:val="19"/>
               </w:rPr>
-              <w:t xml:space="preserve">3,200,000</w:t>
+              <w:t xml:space="preserve">4,500,000</w:t>
             </w:r>
           </w:p>
         </w:tc>
@@ -2562,7 +3024,7 @@
                 <w:sz w:val="19"/>
                 <w:szCs w:val="19"/>
               </w:rPr>
-              <w:t xml:space="preserve">3,200,000</w:t>
+              <w:t xml:space="preserve">4,500,000</w:t>
             </w:r>
           </w:p>
         </w:tc>
@@ -2622,7 +3084,7 @@
                 <w:sz w:val="19"/>
                 <w:szCs w:val="19"/>
               </w:rPr>
-              <w:t xml:space="preserve">암 마운트 포함</w:t>
+              <w:t xml:space="preserve">터치 지원, 암 마운트 포함</w:t>
             </w:r>
           </w:p>
         </w:tc>
@@ -2680,7 +3142,7 @@
                 <w:sz w:val="19"/>
                 <w:szCs w:val="19"/>
               </w:rPr>
-              <w:t xml:space="preserve">800,000</w:t>
+              <w:t xml:space="preserve">1,000,000</w:t>
             </w:r>
           </w:p>
         </w:tc>
@@ -2709,7 +3171,7 @@
                 <w:sz w:val="19"/>
                 <w:szCs w:val="19"/>
               </w:rPr>
-              <w:t xml:space="preserve">800,000</w:t>
+              <w:t xml:space="preserve">1,000,000</w:t>
             </w:r>
           </w:p>
         </w:tc>
@@ -2769,7 +3231,7 @@
                 <w:sz w:val="19"/>
                 <w:szCs w:val="19"/>
               </w:rPr>
-              <w:t xml:space="preserve">Windows 10 IoT</w:t>
+              <w:t xml:space="preserve">Windows IoT</w:t>
             </w:r>
           </w:p>
         </w:tc>
@@ -3008,12 +3470,29 @@
                 <w:sz w:val="19"/>
                 <w:szCs w:val="19"/>
               </w:rPr>
-              <w:t xml:space="preserve">14,500,000</w:t>
+              <w:t xml:space="preserve">35,000,000</w:t>
             </w:r>
           </w:p>
         </w:tc>
       </w:tr>
     </w:tbl>
+    <w:p>
+      <w:pPr>
+        <w:spacing w:after="30" w:before="30"/>
+        <w:ind w:left="200"/>
+      </w:pPr>
+      <w:r>
+        <w:rPr>
+          <w:rFonts w:ascii="맑은 고딕" w:cs="맑은 고딕" w:eastAsia="맑은 고딕" w:hAnsi="맑은 고딕"/>
+          <w:i/>
+          <w:iCs/>
+          <w:color w:val="666666"/>
+          <w:sz w:val="18"/>
+          <w:szCs w:val="18"/>
+        </w:rPr>
+        <w:t xml:space="preserve">※ 검출 정확도에 직결되는 핵심 자산으로, 하향 조정 시 딥러닝 성능 저하가 우려되어 사양을 유지합니다.</w:t>
+      </w:r>
+    </w:p>
     <w:p>
       <w:pPr>
         <w:spacing w:after="0" w:before="0"/>
@@ -3764,7 +4243,7 @@
                 <w:sz w:val="19"/>
                 <w:szCs w:val="19"/>
               </w:rPr>
-              <w:t xml:space="preserve">700,000</w:t>
+              <w:t xml:space="preserve">600,000</w:t>
             </w:r>
           </w:p>
         </w:tc>
@@ -3793,7 +4272,7 @@
                 <w:sz w:val="19"/>
                 <w:szCs w:val="19"/>
               </w:rPr>
-              <w:t xml:space="preserve">1,400,000</w:t>
+              <w:t xml:space="preserve">1,200,000</w:t>
             </w:r>
           </w:p>
         </w:tc>
@@ -3911,7 +4390,7 @@
                 <w:sz w:val="19"/>
                 <w:szCs w:val="19"/>
               </w:rPr>
-              <w:t xml:space="preserve">600,000</w:t>
+              <w:t xml:space="preserve">500,000</w:t>
             </w:r>
           </w:p>
         </w:tc>
@@ -3940,7 +4419,7 @@
                 <w:sz w:val="19"/>
                 <w:szCs w:val="19"/>
               </w:rPr>
-              <w:t xml:space="preserve">600,000</w:t>
+              <w:t xml:space="preserve">500,000</w:t>
             </w:r>
           </w:p>
         </w:tc>
@@ -4205,7 +4684,7 @@
                 <w:sz w:val="19"/>
                 <w:szCs w:val="19"/>
               </w:rPr>
-              <w:t xml:space="preserve">700,000</w:t>
+              <w:t xml:space="preserve">500,000</w:t>
             </w:r>
           </w:p>
         </w:tc>
@@ -4234,7 +4713,7 @@
                 <w:sz w:val="19"/>
                 <w:szCs w:val="19"/>
               </w:rPr>
-              <w:t xml:space="preserve">700,000</w:t>
+              <w:t xml:space="preserve">500,000</w:t>
             </w:r>
           </w:p>
         </w:tc>
@@ -4386,7 +4865,7 @@
                 <w:sz w:val="19"/>
                 <w:szCs w:val="19"/>
               </w:rPr>
-              <w:t xml:space="preserve">7,500,000</w:t>
+              <w:t xml:space="preserve">7,000,000</w:t>
             </w:r>
           </w:p>
         </w:tc>
@@ -4701,7 +5180,7 @@
                 <w:sz w:val="19"/>
                 <w:szCs w:val="19"/>
               </w:rPr>
-              <w:t xml:space="preserve">1,800,000</w:t>
+              <w:t xml:space="preserve">1,600,000</w:t>
             </w:r>
           </w:p>
         </w:tc>
@@ -4730,7 +5209,7 @@
                 <w:sz w:val="19"/>
                 <w:szCs w:val="19"/>
               </w:rPr>
-              <w:t xml:space="preserve">1,800,000</w:t>
+              <w:t xml:space="preserve">1,600,000</w:t>
             </w:r>
           </w:p>
         </w:tc>
@@ -4790,7 +5269,7 @@
                 <w:sz w:val="19"/>
                 <w:szCs w:val="19"/>
               </w:rPr>
-              <w:t xml:space="preserve">폭 100mm, 표준품</w:t>
+              <w:t xml:space="preserve">폭 100mm, 표준 규격품</w:t>
             </w:r>
           </w:p>
         </w:tc>
@@ -4848,7 +5327,7 @@
                 <w:sz w:val="19"/>
                 <w:szCs w:val="19"/>
               </w:rPr>
-              <w:t xml:space="preserve">1,400,000</w:t>
+              <w:t xml:space="preserve">1,200,000</w:t>
             </w:r>
           </w:p>
         </w:tc>
@@ -4877,7 +5356,7 @@
                 <w:sz w:val="19"/>
                 <w:szCs w:val="19"/>
               </w:rPr>
-              <w:t xml:space="preserve">2,800,000</w:t>
+              <w:t xml:space="preserve">2,400,000</w:t>
             </w:r>
           </w:p>
         </w:tc>
@@ -4995,7 +5474,7 @@
                 <w:sz w:val="19"/>
                 <w:szCs w:val="19"/>
               </w:rPr>
-              <w:t xml:space="preserve">1,800,000</w:t>
+              <w:t xml:space="preserve">1,500,000</w:t>
             </w:r>
           </w:p>
         </w:tc>
@@ -5024,7 +5503,7 @@
                 <w:sz w:val="19"/>
                 <w:szCs w:val="19"/>
               </w:rPr>
-              <w:t xml:space="preserve">1,800,000</w:t>
+              <w:t xml:space="preserve">1,500,000</w:t>
             </w:r>
           </w:p>
         </w:tc>
@@ -5142,7 +5621,7 @@
                 <w:sz w:val="19"/>
                 <w:szCs w:val="19"/>
               </w:rPr>
-              <w:t xml:space="preserve">1,700,000</w:t>
+              <w:t xml:space="preserve">1,500,000</w:t>
             </w:r>
           </w:p>
         </w:tc>
@@ -5171,7 +5650,7 @@
                 <w:sz w:val="19"/>
                 <w:szCs w:val="19"/>
               </w:rPr>
-              <w:t xml:space="preserve">1,700,000</w:t>
+              <w:t xml:space="preserve">1,500,000</w:t>
             </w:r>
           </w:p>
         </w:tc>
@@ -5289,7 +5768,7 @@
                 <w:sz w:val="19"/>
                 <w:szCs w:val="19"/>
               </w:rPr>
-              <w:t xml:space="preserve">1,400,000</w:t>
+              <w:t xml:space="preserve">1,200,000</w:t>
             </w:r>
           </w:p>
         </w:tc>
@@ -5318,7 +5797,7 @@
                 <w:sz w:val="19"/>
                 <w:szCs w:val="19"/>
               </w:rPr>
-              <w:t xml:space="preserve">1,400,000</w:t>
+              <w:t xml:space="preserve">1,200,000</w:t>
             </w:r>
           </w:p>
         </w:tc>
@@ -5436,7 +5915,7 @@
                 <w:sz w:val="19"/>
                 <w:szCs w:val="19"/>
               </w:rPr>
-              <w:t xml:space="preserve">1,200,000</w:t>
+              <w:t xml:space="preserve">1,000,000</w:t>
             </w:r>
           </w:p>
         </w:tc>
@@ -5465,7 +5944,7 @@
                 <w:sz w:val="19"/>
                 <w:szCs w:val="19"/>
               </w:rPr>
-              <w:t xml:space="preserve">1,200,000</w:t>
+              <w:t xml:space="preserve">1,000,000</w:t>
             </w:r>
           </w:p>
         </w:tc>
@@ -5583,7 +6062,7 @@
                 <w:sz w:val="19"/>
                 <w:szCs w:val="19"/>
               </w:rPr>
-              <w:t xml:space="preserve">800,000</w:t>
+              <w:t xml:space="preserve">700,000</w:t>
             </w:r>
           </w:p>
         </w:tc>
@@ -5612,7 +6091,7 @@
                 <w:sz w:val="19"/>
                 <w:szCs w:val="19"/>
               </w:rPr>
-              <w:t xml:space="preserve">800,000</w:t>
+              <w:t xml:space="preserve">700,000</w:t>
             </w:r>
           </w:p>
         </w:tc>
@@ -5730,7 +6209,7 @@
                 <w:sz w:val="19"/>
                 <w:szCs w:val="19"/>
               </w:rPr>
-              <w:t xml:space="preserve">1,500,000</w:t>
+              <w:t xml:space="preserve">600,000</w:t>
             </w:r>
           </w:p>
         </w:tc>
@@ -5759,7 +6238,7 @@
                 <w:sz w:val="19"/>
                 <w:szCs w:val="19"/>
               </w:rPr>
-              <w:t xml:space="preserve">1,500,000</w:t>
+              <w:t xml:space="preserve">600,000</w:t>
             </w:r>
           </w:p>
         </w:tc>
@@ -5911,7 +6390,7 @@
                 <w:sz w:val="19"/>
                 <w:szCs w:val="19"/>
               </w:rPr>
-              <w:t xml:space="preserve">13,000,000</w:t>
+              <w:t xml:space="preserve">10,500,000</w:t>
             </w:r>
           </w:p>
         </w:tc>
@@ -6226,7 +6705,7 @@
                 <w:sz w:val="19"/>
                 <w:szCs w:val="19"/>
               </w:rPr>
-              <w:t xml:space="preserve">1,500,000</w:t>
+              <w:t xml:space="preserve">1,300,000</w:t>
             </w:r>
           </w:p>
         </w:tc>
@@ -6255,7 +6734,7 @@
                 <w:sz w:val="19"/>
                 <w:szCs w:val="19"/>
               </w:rPr>
-              <w:t xml:space="preserve">1,500,000</w:t>
+              <w:t xml:space="preserve">1,300,000</w:t>
             </w:r>
           </w:p>
         </w:tc>
@@ -6373,7 +6852,7 @@
                 <w:sz w:val="19"/>
                 <w:szCs w:val="19"/>
               </w:rPr>
-              <w:t xml:space="preserve">800,000</w:t>
+              <w:t xml:space="preserve">700,000</w:t>
             </w:r>
           </w:p>
         </w:tc>
@@ -6402,7 +6881,7 @@
                 <w:sz w:val="19"/>
                 <w:szCs w:val="19"/>
               </w:rPr>
-              <w:t xml:space="preserve">800,000</w:t>
+              <w:t xml:space="preserve">700,000</w:t>
             </w:r>
           </w:p>
         </w:tc>
@@ -6520,7 +6999,7 @@
                 <w:sz w:val="19"/>
                 <w:szCs w:val="19"/>
               </w:rPr>
-              <w:t xml:space="preserve">800,000</w:t>
+              <w:t xml:space="preserve">700,000</w:t>
             </w:r>
           </w:p>
         </w:tc>
@@ -6549,7 +7028,7 @@
                 <w:sz w:val="19"/>
                 <w:szCs w:val="19"/>
               </w:rPr>
-              <w:t xml:space="preserve">800,000</w:t>
+              <w:t xml:space="preserve">700,000</w:t>
             </w:r>
           </w:p>
         </w:tc>
@@ -6667,7 +7146,7 @@
                 <w:sz w:val="19"/>
                 <w:szCs w:val="19"/>
               </w:rPr>
-              <w:t xml:space="preserve">1,400,000</w:t>
+              <w:t xml:space="preserve">1,200,000</w:t>
             </w:r>
           </w:p>
         </w:tc>
@@ -6696,7 +7175,7 @@
                 <w:sz w:val="19"/>
                 <w:szCs w:val="19"/>
               </w:rPr>
-              <w:t xml:space="preserve">1,400,000</w:t>
+              <w:t xml:space="preserve">1,200,000</w:t>
             </w:r>
           </w:p>
         </w:tc>
@@ -6814,7 +7293,7 @@
                 <w:sz w:val="19"/>
                 <w:szCs w:val="19"/>
               </w:rPr>
-              <w:t xml:space="preserve">500,000</w:t>
+              <w:t xml:space="preserve">400,000</w:t>
             </w:r>
           </w:p>
         </w:tc>
@@ -6843,7 +7322,7 @@
                 <w:sz w:val="19"/>
                 <w:szCs w:val="19"/>
               </w:rPr>
-              <w:t xml:space="preserve">500,000</w:t>
+              <w:t xml:space="preserve">400,000</w:t>
             </w:r>
           </w:p>
         </w:tc>
@@ -6961,7 +7440,7 @@
                 <w:sz w:val="19"/>
                 <w:szCs w:val="19"/>
               </w:rPr>
-              <w:t xml:space="preserve">1,500,000</w:t>
+              <w:t xml:space="preserve">1,000,000</w:t>
             </w:r>
           </w:p>
         </w:tc>
@@ -6990,7 +7469,7 @@
                 <w:sz w:val="19"/>
                 <w:szCs w:val="19"/>
               </w:rPr>
-              <w:t xml:space="preserve">1,500,000</w:t>
+              <w:t xml:space="preserve">1,000,000</w:t>
             </w:r>
           </w:p>
         </w:tc>
@@ -7142,7 +7621,7 @@
                 <w:sz w:val="19"/>
                 <w:szCs w:val="19"/>
               </w:rPr>
-              <w:t xml:space="preserve">6,500,000</w:t>
+              <w:t xml:space="preserve">5,300,000</w:t>
             </w:r>
           </w:p>
         </w:tc>
@@ -7166,7 +7645,7 @@
           <w:sz w:val="21"/>
           <w:szCs w:val="21"/>
         </w:rPr>
-        <w:t xml:space="preserve">2-5. 개발 인건비 (60 M/D)</w:t>
+        <w:t xml:space="preserve">2-5. 개발 인건비 (29 M/D)</w:t>
       </w:r>
     </w:p>
     <w:tbl>
@@ -7428,7 +7907,7 @@
                 <w:sz w:val="19"/>
                 <w:szCs w:val="19"/>
               </w:rPr>
-              <w:t xml:space="preserve">18</w:t>
+              <w:t xml:space="preserve">9</w:t>
             </w:r>
           </w:p>
         </w:tc>
@@ -7457,7 +7936,7 @@
                 <w:sz w:val="19"/>
                 <w:szCs w:val="19"/>
               </w:rPr>
-              <w:t xml:space="preserve">8,100,000</w:t>
+              <w:t xml:space="preserve">4,050,000</w:t>
             </w:r>
           </w:p>
         </w:tc>
@@ -7575,7 +8054,7 @@
                 <w:sz w:val="19"/>
                 <w:szCs w:val="19"/>
               </w:rPr>
-              <w:t xml:space="preserve">15</w:t>
+              <w:t xml:space="preserve">7</w:t>
             </w:r>
           </w:p>
         </w:tc>
@@ -7604,7 +8083,7 @@
                 <w:sz w:val="19"/>
                 <w:szCs w:val="19"/>
               </w:rPr>
-              <w:t xml:space="preserve">5,250,000</w:t>
+              <w:t xml:space="preserve">2,450,000</w:t>
             </w:r>
           </w:p>
         </w:tc>
@@ -7722,7 +8201,7 @@
                 <w:sz w:val="19"/>
                 <w:szCs w:val="19"/>
               </w:rPr>
-              <w:t xml:space="preserve">8</w:t>
+              <w:t xml:space="preserve">4</w:t>
             </w:r>
           </w:p>
         </w:tc>
@@ -7751,7 +8230,7 @@
                 <w:sz w:val="19"/>
                 <w:szCs w:val="19"/>
               </w:rPr>
-              <w:t xml:space="preserve">2,560,000</w:t>
+              <w:t xml:space="preserve">1,280,000</w:t>
             </w:r>
           </w:p>
         </w:tc>
@@ -7869,7 +8348,7 @@
                 <w:sz w:val="19"/>
                 <w:szCs w:val="19"/>
               </w:rPr>
-              <w:t xml:space="preserve">7</w:t>
+              <w:t xml:space="preserve">3</w:t>
             </w:r>
           </w:p>
         </w:tc>
@@ -7898,7 +8377,7 @@
                 <w:sz w:val="19"/>
                 <w:szCs w:val="19"/>
               </w:rPr>
-              <w:t xml:space="preserve">2,100,000</w:t>
+              <w:t xml:space="preserve">900,000</w:t>
             </w:r>
           </w:p>
         </w:tc>
@@ -8016,7 +8495,7 @@
                 <w:sz w:val="19"/>
                 <w:szCs w:val="19"/>
               </w:rPr>
-              <w:t xml:space="preserve">7</w:t>
+              <w:t xml:space="preserve">4</w:t>
             </w:r>
           </w:p>
         </w:tc>
@@ -8045,7 +8524,7 @@
                 <w:sz w:val="19"/>
                 <w:szCs w:val="19"/>
               </w:rPr>
-              <w:t xml:space="preserve">1,960,000</w:t>
+              <w:t xml:space="preserve">1,120,000</w:t>
             </w:r>
           </w:p>
         </w:tc>
@@ -8163,7 +8642,7 @@
                 <w:sz w:val="19"/>
                 <w:szCs w:val="19"/>
               </w:rPr>
-              <w:t xml:space="preserve">5</w:t>
+              <w:t xml:space="preserve">2</w:t>
             </w:r>
           </w:p>
         </w:tc>
@@ -8192,7 +8671,7 @@
                 <w:sz w:val="19"/>
                 <w:szCs w:val="19"/>
               </w:rPr>
-              <w:t xml:space="preserve">1,500,000</w:t>
+              <w:t xml:space="preserve">600,000</w:t>
             </w:r>
           </w:p>
         </w:tc>
@@ -8313,7 +8792,7 @@
                 <w:sz w:val="19"/>
                 <w:szCs w:val="19"/>
               </w:rPr>
-              <w:t xml:space="preserve">60</w:t>
+              <w:t xml:space="preserve">29</w:t>
             </w:r>
           </w:p>
         </w:tc>
@@ -8343,7 +8822,7 @@
                 <w:sz w:val="19"/>
                 <w:szCs w:val="19"/>
               </w:rPr>
-              <w:t xml:space="preserve">21,470,000</w:t>
+              <w:t xml:space="preserve">10,400,000</w:t>
             </w:r>
           </w:p>
         </w:tc>
@@ -8381,19 +8860,84 @@
     </w:tbl>
     <w:p>
       <w:pPr>
-        <w:spacing w:after="30" w:before="30"/>
+        <w:spacing w:after="0" w:before="0"/>
+      </w:pPr>
+    </w:p>
+    <w:p>
+      <w:pPr>
+        <w:spacing w:after="40" w:before="40"/>
         <w:ind w:left="200"/>
       </w:pPr>
       <w:r>
         <w:rPr>
           <w:rFonts w:ascii="맑은 고딕" w:cs="맑은 고딕" w:eastAsia="맑은 고딕" w:hAnsi="맑은 고딕"/>
-          <w:i/>
-          <w:iCs/>
-          <w:color w:val="666666"/>
-          <w:sz w:val="18"/>
-          <w:szCs w:val="18"/>
+          <w:b/>
+          <w:bCs/>
+          <w:color w:val="B91C1C"/>
+          <w:sz w:val="19"/>
+          <w:szCs w:val="19"/>
         </w:rPr>
-        <w:t xml:space="preserve">※ 개발 40일 + 테스트 10일 기간 내 병렬 투입 기준. 단가는 협력사 실단가 반영.</w:t>
+        <w:t xml:space="preserve">※ 29 M/D는 표준 개발 공수(50~60 M/D) 대비 빠듯한 수준입니다. 아래 전제가 충족되어야 달성 가능합니다.</w:t>
+      </w:r>
+    </w:p>
+    <w:p>
+      <w:pPr>
+        <w:spacing w:after="20" w:before="20"/>
+        <w:ind w:left="280"/>
+      </w:pPr>
+      <w:r>
+        <w:rPr>
+          <w:rFonts w:ascii="맑은 고딕" w:cs="맑은 고딕" w:eastAsia="맑은 고딕" w:hAnsi="맑은 고딕"/>
+          <w:color w:val="2E2E2E"/>
+          <w:sz w:val="20"/>
+          <w:szCs w:val="20"/>
+        </w:rPr>
+        <w:t xml:space="preserve">· 협력사 기보유 딥러닝 프레임워크·검사 로직 템플릿 재활용</w:t>
+      </w:r>
+    </w:p>
+    <w:p>
+      <w:pPr>
+        <w:spacing w:after="20" w:before="20"/>
+        <w:ind w:left="280"/>
+      </w:pPr>
+      <w:r>
+        <w:rPr>
+          <w:rFonts w:ascii="맑은 고딕" w:cs="맑은 고딕" w:eastAsia="맑은 고딕" w:hAnsi="맑은 고딕"/>
+          <w:color w:val="2E2E2E"/>
+          <w:sz w:val="20"/>
+          <w:szCs w:val="20"/>
+        </w:rPr>
+        <w:t xml:space="preserve">· 위너콤으로부터 불량 이미지·판정 이력 데이터 사전 제공 (학습 데이터 확보 공수 절감)</w:t>
+      </w:r>
+    </w:p>
+    <w:p>
+      <w:pPr>
+        <w:spacing w:after="20" w:before="20"/>
+        <w:ind w:left="280"/>
+      </w:pPr>
+      <w:r>
+        <w:rPr>
+          <w:rFonts w:ascii="맑은 고딕" w:cs="맑은 고딕" w:eastAsia="맑은 고딕" w:hAnsi="맑은 고딕"/>
+          <w:color w:val="2E2E2E"/>
+          <w:sz w:val="20"/>
+          <w:szCs w:val="20"/>
+        </w:rPr>
+        <w:t xml:space="preserve">· 기구 설계는 표준 컨베어·지그 도면 재사용</w:t>
+      </w:r>
+    </w:p>
+    <w:p>
+      <w:pPr>
+        <w:spacing w:after="20" w:before="20"/>
+        <w:ind w:left="280"/>
+      </w:pPr>
+      <w:r>
+        <w:rPr>
+          <w:rFonts w:ascii="맑은 고딕" w:cs="맑은 고딕" w:eastAsia="맑은 고딕" w:hAnsi="맑은 고딕"/>
+          <w:color w:val="2E2E2E"/>
+          <w:sz w:val="20"/>
+          <w:szCs w:val="20"/>
+        </w:rPr>
+        <w:t xml:space="preserve">· 검사 항목을 PCB 외관 불량 5종(실장·납땜·누락·극성·이물)으로 한정</w:t>
       </w:r>
     </w:p>
     <w:p>
@@ -8581,25 +9125,26 @@
         <w:tc>
           <w:tcPr>
             <w:tcW w:type="dxa" w:w="1000"/>
-            <w:tcMar>
-              <w:top w:type="dxa" w:w="40"/>
-              <w:left w:type="dxa" w:w="80"/>
-              <w:bottom w:type="dxa" w:w="40"/>
-              <w:right w:type="dxa" w:w="80"/>
-            </w:tcMar>
-            <w:vAlign w:val="center"/>
-          </w:tcPr>
-          <w:p>
-            <w:pPr>
-              <w:spacing w:after="0" w:before="0"/>
-              <w:jc w:val="left"/>
-            </w:pPr>
-            <w:r>
-              <w:rPr>
-                <w:rFonts w:ascii="맑은 고딕" w:cs="맑은 고딕" w:eastAsia="맑은 고딕" w:hAnsi="맑은 고딕"/>
-                <w:b w:val="false"/>
-                <w:bCs w:val="false"/>
-                <w:color w:val="2E2E2E"/>
+            <w:shd w:fill="FEF9E7" w:val="clear"/>
+            <w:tcMar>
+              <w:top w:type="dxa" w:w="40"/>
+              <w:left w:type="dxa" w:w="80"/>
+              <w:bottom w:type="dxa" w:w="40"/>
+              <w:right w:type="dxa" w:w="80"/>
+            </w:tcMar>
+            <w:vAlign w:val="center"/>
+          </w:tcPr>
+          <w:p>
+            <w:pPr>
+              <w:spacing w:after="0" w:before="0"/>
+              <w:jc w:val="left"/>
+            </w:pPr>
+            <w:r>
+              <w:rPr>
+                <w:rFonts w:ascii="맑은 고딕" w:cs="맑은 고딕" w:eastAsia="맑은 고딕" w:hAnsi="맑은 고딕"/>
+                <w:b/>
+                <w:bCs/>
+                <w:color w:val="92400E"/>
                 <w:sz w:val="19"/>
                 <w:szCs w:val="19"/>
               </w:rPr>
@@ -8610,87 +9155,90 @@
         <w:tc>
           <w:tcPr>
             <w:tcW w:type="dxa" w:w="4552"/>
-            <w:tcMar>
-              <w:top w:type="dxa" w:w="40"/>
-              <w:left w:type="dxa" w:w="80"/>
-              <w:bottom w:type="dxa" w:w="40"/>
-              <w:right w:type="dxa" w:w="80"/>
-            </w:tcMar>
-            <w:vAlign w:val="center"/>
-          </w:tcPr>
-          <w:p>
-            <w:pPr>
-              <w:spacing w:after="0" w:before="0"/>
-              <w:jc w:val="left"/>
-            </w:pPr>
-            <w:r>
-              <w:rPr>
-                <w:rFonts w:ascii="맑은 고딕" w:cs="맑은 고딕" w:eastAsia="맑은 고딕" w:hAnsi="맑은 고딕"/>
-                <w:b w:val="false"/>
-                <w:bCs w:val="false"/>
-                <w:color w:val="2E2E2E"/>
-                <w:sz w:val="19"/>
-                <w:szCs w:val="19"/>
-              </w:rPr>
-              <w:t xml:space="preserve">SW 라이선스 및 PC</w:t>
+            <w:shd w:fill="FEF9E7" w:val="clear"/>
+            <w:tcMar>
+              <w:top w:type="dxa" w:w="40"/>
+              <w:left w:type="dxa" w:w="80"/>
+              <w:bottom w:type="dxa" w:w="40"/>
+              <w:right w:type="dxa" w:w="80"/>
+            </w:tcMar>
+            <w:vAlign w:val="center"/>
+          </w:tcPr>
+          <w:p>
+            <w:pPr>
+              <w:spacing w:after="0" w:before="0"/>
+              <w:jc w:val="left"/>
+            </w:pPr>
+            <w:r>
+              <w:rPr>
+                <w:rFonts w:ascii="맑은 고딕" w:cs="맑은 고딕" w:eastAsia="맑은 고딕" w:hAnsi="맑은 고딕"/>
+                <w:b/>
+                <w:bCs/>
+                <w:color w:val="92400E"/>
+                <w:sz w:val="19"/>
+                <w:szCs w:val="19"/>
+              </w:rPr>
+              <w:t xml:space="preserve">SW 라이선스 및 PC (고정)</w:t>
             </w:r>
           </w:p>
         </w:tc>
         <w:tc>
           <w:tcPr>
             <w:tcW w:type="dxa" w:w="2200"/>
-            <w:tcMar>
-              <w:top w:type="dxa" w:w="40"/>
-              <w:left w:type="dxa" w:w="80"/>
-              <w:bottom w:type="dxa" w:w="40"/>
-              <w:right w:type="dxa" w:w="80"/>
-            </w:tcMar>
-            <w:vAlign w:val="center"/>
-          </w:tcPr>
-          <w:p>
-            <w:pPr>
-              <w:spacing w:after="0" w:before="0"/>
-              <w:jc w:val="right"/>
-            </w:pPr>
-            <w:r>
-              <w:rPr>
-                <w:rFonts w:ascii="맑은 고딕" w:cs="맑은 고딕" w:eastAsia="맑은 고딕" w:hAnsi="맑은 고딕"/>
-                <w:b w:val="false"/>
-                <w:bCs w:val="false"/>
-                <w:color w:val="2E2E2E"/>
-                <w:sz w:val="19"/>
-                <w:szCs w:val="19"/>
-              </w:rPr>
-              <w:t xml:space="preserve">14,500,000</w:t>
+            <w:shd w:fill="FEF9E7" w:val="clear"/>
+            <w:tcMar>
+              <w:top w:type="dxa" w:w="40"/>
+              <w:left w:type="dxa" w:w="80"/>
+              <w:bottom w:type="dxa" w:w="40"/>
+              <w:right w:type="dxa" w:w="80"/>
+            </w:tcMar>
+            <w:vAlign w:val="center"/>
+          </w:tcPr>
+          <w:p>
+            <w:pPr>
+              <w:spacing w:after="0" w:before="0"/>
+              <w:jc w:val="right"/>
+            </w:pPr>
+            <w:r>
+              <w:rPr>
+                <w:rFonts w:ascii="맑은 고딕" w:cs="맑은 고딕" w:eastAsia="맑은 고딕" w:hAnsi="맑은 고딕"/>
+                <w:b/>
+                <w:bCs/>
+                <w:color w:val="92400E"/>
+                <w:sz w:val="19"/>
+                <w:szCs w:val="19"/>
+              </w:rPr>
+              <w:t xml:space="preserve">35,000,000</w:t>
             </w:r>
           </w:p>
         </w:tc>
         <w:tc>
           <w:tcPr>
             <w:tcW w:type="dxa" w:w="2000"/>
-            <w:tcMar>
-              <w:top w:type="dxa" w:w="40"/>
-              <w:left w:type="dxa" w:w="80"/>
-              <w:bottom w:type="dxa" w:w="40"/>
-              <w:right w:type="dxa" w:w="80"/>
-            </w:tcMar>
-            <w:vAlign w:val="center"/>
-          </w:tcPr>
-          <w:p>
-            <w:pPr>
-              <w:spacing w:after="0" w:before="0"/>
-              <w:jc w:val="right"/>
-            </w:pPr>
-            <w:r>
-              <w:rPr>
-                <w:rFonts w:ascii="맑은 고딕" w:cs="맑은 고딕" w:eastAsia="맑은 고딕" w:hAnsi="맑은 고딕"/>
-                <w:b w:val="false"/>
-                <w:bCs w:val="false"/>
-                <w:color w:val="2E2E2E"/>
-                <w:sz w:val="19"/>
-                <w:szCs w:val="19"/>
-              </w:rPr>
-              <w:t xml:space="preserve">22.4%</w:t>
+            <w:shd w:fill="FEF9E7" w:val="clear"/>
+            <w:tcMar>
+              <w:top w:type="dxa" w:w="40"/>
+              <w:left w:type="dxa" w:w="80"/>
+              <w:bottom w:type="dxa" w:w="40"/>
+              <w:right w:type="dxa" w:w="80"/>
+            </w:tcMar>
+            <w:vAlign w:val="center"/>
+          </w:tcPr>
+          <w:p>
+            <w:pPr>
+              <w:spacing w:after="0" w:before="0"/>
+              <w:jc w:val="right"/>
+            </w:pPr>
+            <w:r>
+              <w:rPr>
+                <w:rFonts w:ascii="맑은 고딕" w:cs="맑은 고딕" w:eastAsia="맑은 고딕" w:hAnsi="맑은 고딕"/>
+                <w:b/>
+                <w:bCs/>
+                <w:color w:val="92400E"/>
+                <w:sz w:val="19"/>
+                <w:szCs w:val="19"/>
+              </w:rPr>
+              <w:t xml:space="preserve">50.7%</w:t>
             </w:r>
           </w:p>
         </w:tc>
@@ -8779,7 +9327,7 @@
                 <w:sz w:val="19"/>
                 <w:szCs w:val="19"/>
               </w:rPr>
-              <w:t xml:space="preserve">7,500,000</w:t>
+              <w:t xml:space="preserve">7,000,000</w:t>
             </w:r>
           </w:p>
         </w:tc>
@@ -8808,7 +9356,7 @@
                 <w:sz w:val="19"/>
                 <w:szCs w:val="19"/>
               </w:rPr>
-              <w:t xml:space="preserve">11.6%</w:t>
+              <w:t xml:space="preserve">10.1%</w:t>
             </w:r>
           </w:p>
         </w:tc>
@@ -8897,7 +9445,7 @@
                 <w:sz w:val="19"/>
                 <w:szCs w:val="19"/>
               </w:rPr>
-              <w:t xml:space="preserve">13,000,000</w:t>
+              <w:t xml:space="preserve">10,500,000</w:t>
             </w:r>
           </w:p>
         </w:tc>
@@ -8926,7 +9474,7 @@
                 <w:sz w:val="19"/>
                 <w:szCs w:val="19"/>
               </w:rPr>
-              <w:t xml:space="preserve">20.1%</w:t>
+              <w:t xml:space="preserve">15.2%</w:t>
             </w:r>
           </w:p>
         </w:tc>
@@ -9015,7 +9563,7 @@
                 <w:sz w:val="19"/>
                 <w:szCs w:val="19"/>
               </w:rPr>
-              <w:t xml:space="preserve">6,500,000</w:t>
+              <w:t xml:space="preserve">5,300,000</w:t>
             </w:r>
           </w:p>
         </w:tc>
@@ -9044,7 +9592,7 @@
                 <w:sz w:val="19"/>
                 <w:szCs w:val="19"/>
               </w:rPr>
-              <w:t xml:space="preserve">10.0%</w:t>
+              <w:t xml:space="preserve">7.7%</w:t>
             </w:r>
           </w:p>
         </w:tc>
@@ -9133,7 +9681,7 @@
                 <w:sz w:val="19"/>
                 <w:szCs w:val="19"/>
               </w:rPr>
-              <w:t xml:space="preserve">21,470,000</w:t>
+              <w:t xml:space="preserve">10,400,000</w:t>
             </w:r>
           </w:p>
         </w:tc>
@@ -9162,7 +9710,7 @@
                 <w:sz w:val="19"/>
                 <w:szCs w:val="19"/>
               </w:rPr>
-              <w:t xml:space="preserve">33.1%</w:t>
+              <w:t xml:space="preserve">15.1%</w:t>
             </w:r>
           </w:p>
         </w:tc>
@@ -9254,7 +9802,7 @@
                 <w:sz w:val="19"/>
                 <w:szCs w:val="19"/>
               </w:rPr>
-              <w:t xml:space="preserve">62,970,000</w:t>
+              <w:t xml:space="preserve">68,200,000</w:t>
             </w:r>
           </w:p>
         </w:tc>
@@ -9284,7 +9832,7 @@
                 <w:sz w:val="19"/>
                 <w:szCs w:val="19"/>
               </w:rPr>
-              <w:t xml:space="preserve">97.2%</w:t>
+              <w:t xml:space="preserve">98.8%</w:t>
             </w:r>
           </w:p>
         </w:tc>
@@ -9344,7 +9892,7 @@
                 <w:sz w:val="19"/>
                 <w:szCs w:val="19"/>
               </w:rPr>
-              <w:t xml:space="preserve">예비비 (약 3%)</w:t>
+              <w:t xml:space="preserve">예비비</w:t>
             </w:r>
           </w:p>
         </w:tc>
@@ -9373,7 +9921,7 @@
                 <w:sz w:val="19"/>
                 <w:szCs w:val="19"/>
               </w:rPr>
-              <w:t xml:space="preserve">2,000,000</w:t>
+              <w:t xml:space="preserve">800,000</w:t>
             </w:r>
           </w:p>
         </w:tc>
@@ -9402,7 +9950,7 @@
                 <w:sz w:val="19"/>
                 <w:szCs w:val="19"/>
               </w:rPr>
-              <w:t xml:space="preserve">2.8%</w:t>
+              <w:t xml:space="preserve">1.2%</w:t>
             </w:r>
           </w:p>
         </w:tc>
@@ -9494,7 +10042,7 @@
                 <w:sz w:val="19"/>
                 <w:szCs w:val="19"/>
               </w:rPr>
-              <w:t xml:space="preserve">64,970,000</w:t>
+              <w:t xml:space="preserve">69,000,000</w:t>
             </w:r>
           </w:p>
         </w:tc>
@@ -9575,7 +10123,7 @@
         </w:trPr>
         <w:tc>
           <w:tcPr>
-            <w:tcW w:type="dxa" w:w="3200"/>
+            <w:tcW w:type="dxa" w:w="3400"/>
             <w:shd w:fill="D9E2F3" w:val="clear"/>
             <w:tcMar>
               <w:top w:type="dxa" w:w="40"/>
@@ -9605,7 +10153,7 @@
         </w:tc>
         <w:tc>
           <w:tcPr>
-            <w:tcW w:type="dxa" w:w="3000"/>
+            <w:tcW w:type="dxa" w:w="2600"/>
             <w:shd w:fill="D9E2F3" w:val="clear"/>
             <w:tcMar>
               <w:top w:type="dxa" w:w="40"/>
@@ -9635,7 +10183,7 @@
         </w:tc>
         <w:tc>
           <w:tcPr>
-            <w:tcW w:type="dxa" w:w="3552"/>
+            <w:tcW w:type="dxa" w:w="3752"/>
             <w:shd w:fill="D9E2F3" w:val="clear"/>
             <w:tcMar>
               <w:top w:type="dxa" w:w="40"/>
@@ -9667,7 +10215,7 @@
       <w:tr>
         <w:tc>
           <w:tcPr>
-            <w:tcW w:type="dxa" w:w="3200"/>
+            <w:tcW w:type="dxa" w:w="3400"/>
             <w:tcMar>
               <w:top w:type="dxa" w:w="40"/>
               <w:left w:type="dxa" w:w="80"/>
@@ -9696,59 +10244,59 @@
         </w:tc>
         <w:tc>
           <w:tcPr>
-            <w:tcW w:type="dxa" w:w="3000"/>
-            <w:tcMar>
-              <w:top w:type="dxa" w:w="40"/>
-              <w:left w:type="dxa" w:w="80"/>
-              <w:bottom w:type="dxa" w:w="40"/>
-              <w:right w:type="dxa" w:w="80"/>
-            </w:tcMar>
-            <w:vAlign w:val="center"/>
-          </w:tcPr>
-          <w:p>
-            <w:pPr>
-              <w:spacing w:after="0" w:before="0"/>
-              <w:jc w:val="left"/>
-            </w:pPr>
-            <w:r>
-              <w:rPr>
-                <w:rFonts w:ascii="맑은 고딕" w:cs="맑은 고딕" w:eastAsia="맑은 고딕" w:hAnsi="맑은 고딕"/>
-                <w:b w:val="false"/>
-                <w:bCs w:val="false"/>
-                <w:color w:val="2E2E2E"/>
-                <w:sz w:val="19"/>
-                <w:szCs w:val="19"/>
-              </w:rPr>
-              <w:t xml:space="preserve">64,970,000</w:t>
-            </w:r>
-          </w:p>
-        </w:tc>
-        <w:tc>
-          <w:tcPr>
-            <w:tcW w:type="dxa" w:w="3552"/>
-            <w:tcMar>
-              <w:top w:type="dxa" w:w="40"/>
-              <w:left w:type="dxa" w:w="80"/>
-              <w:bottom w:type="dxa" w:w="40"/>
-              <w:right w:type="dxa" w:w="80"/>
-            </w:tcMar>
-            <w:vAlign w:val="center"/>
-          </w:tcPr>
-          <w:p>
-            <w:pPr>
-              <w:spacing w:after="0" w:before="0"/>
-              <w:jc w:val="right"/>
-            </w:pPr>
-            <w:r>
-              <w:rPr>
-                <w:rFonts w:ascii="맑은 고딕" w:cs="맑은 고딕" w:eastAsia="맑은 고딕" w:hAnsi="맑은 고딕"/>
-                <w:b w:val="false"/>
-                <w:bCs w:val="false"/>
-                <w:color w:val="2E2E2E"/>
-                <w:sz w:val="19"/>
-                <w:szCs w:val="19"/>
-              </w:rPr>
-              <w:t xml:space="preserve">재산정 기준</w:t>
+            <w:tcW w:type="dxa" w:w="2600"/>
+            <w:tcMar>
+              <w:top w:type="dxa" w:w="40"/>
+              <w:left w:type="dxa" w:w="80"/>
+              <w:bottom w:type="dxa" w:w="40"/>
+              <w:right w:type="dxa" w:w="80"/>
+            </w:tcMar>
+            <w:vAlign w:val="center"/>
+          </w:tcPr>
+          <w:p>
+            <w:pPr>
+              <w:spacing w:after="0" w:before="0"/>
+              <w:jc w:val="left"/>
+            </w:pPr>
+            <w:r>
+              <w:rPr>
+                <w:rFonts w:ascii="맑은 고딕" w:cs="맑은 고딕" w:eastAsia="맑은 고딕" w:hAnsi="맑은 고딕"/>
+                <w:b w:val="false"/>
+                <w:bCs w:val="false"/>
+                <w:color w:val="2E2E2E"/>
+                <w:sz w:val="19"/>
+                <w:szCs w:val="19"/>
+              </w:rPr>
+              <w:t xml:space="preserve">69,000,000</w:t>
+            </w:r>
+          </w:p>
+        </w:tc>
+        <w:tc>
+          <w:tcPr>
+            <w:tcW w:type="dxa" w:w="3752"/>
+            <w:tcMar>
+              <w:top w:type="dxa" w:w="40"/>
+              <w:left w:type="dxa" w:w="80"/>
+              <w:bottom w:type="dxa" w:w="40"/>
+              <w:right w:type="dxa" w:w="80"/>
+            </w:tcMar>
+            <w:vAlign w:val="center"/>
+          </w:tcPr>
+          <w:p>
+            <w:pPr>
+              <w:spacing w:after="0" w:before="0"/>
+              <w:jc w:val="right"/>
+            </w:pPr>
+            <w:r>
+              <w:rPr>
+                <w:rFonts w:ascii="맑은 고딕" w:cs="맑은 고딕" w:eastAsia="맑은 고딕" w:hAnsi="맑은 고딕"/>
+                <w:b w:val="false"/>
+                <w:bCs w:val="false"/>
+                <w:color w:val="2E2E2E"/>
+                <w:sz w:val="19"/>
+                <w:szCs w:val="19"/>
+              </w:rPr>
+              <w:t xml:space="preserve"/>
             </w:r>
           </w:p>
         </w:tc>
@@ -9756,88 +10304,88 @@
       <w:tr>
         <w:tc>
           <w:tcPr>
-            <w:tcW w:type="dxa" w:w="3200"/>
-            <w:tcMar>
-              <w:top w:type="dxa" w:w="40"/>
-              <w:left w:type="dxa" w:w="80"/>
-              <w:bottom w:type="dxa" w:w="40"/>
-              <w:right w:type="dxa" w:w="80"/>
-            </w:tcMar>
-            <w:vAlign w:val="center"/>
-          </w:tcPr>
-          <w:p>
-            <w:pPr>
-              <w:spacing w:after="0" w:before="0"/>
-              <w:jc w:val="left"/>
-            </w:pPr>
-            <w:r>
-              <w:rPr>
-                <w:rFonts w:ascii="맑은 고딕" w:cs="맑은 고딕" w:eastAsia="맑은 고딕" w:hAnsi="맑은 고딕"/>
-                <w:b w:val="false"/>
-                <w:bCs w:val="false"/>
-                <w:color w:val="2E2E2E"/>
-                <w:sz w:val="19"/>
-                <w:szCs w:val="19"/>
-              </w:rPr>
-              <w:t xml:space="preserve">마진 (23.1%)</w:t>
-            </w:r>
-          </w:p>
-        </w:tc>
-        <w:tc>
-          <w:tcPr>
-            <w:tcW w:type="dxa" w:w="3000"/>
-            <w:tcMar>
-              <w:top w:type="dxa" w:w="40"/>
-              <w:left w:type="dxa" w:w="80"/>
-              <w:bottom w:type="dxa" w:w="40"/>
-              <w:right w:type="dxa" w:w="80"/>
-            </w:tcMar>
-            <w:vAlign w:val="center"/>
-          </w:tcPr>
-          <w:p>
-            <w:pPr>
-              <w:spacing w:after="0" w:before="0"/>
-              <w:jc w:val="left"/>
-            </w:pPr>
-            <w:r>
-              <w:rPr>
-                <w:rFonts w:ascii="맑은 고딕" w:cs="맑은 고딕" w:eastAsia="맑은 고딕" w:hAnsi="맑은 고딕"/>
-                <w:b w:val="false"/>
-                <w:bCs w:val="false"/>
-                <w:color w:val="2E2E2E"/>
-                <w:sz w:val="19"/>
-                <w:szCs w:val="19"/>
-              </w:rPr>
-              <w:t xml:space="preserve">15,030,000</w:t>
-            </w:r>
-          </w:p>
-        </w:tc>
-        <w:tc>
-          <w:tcPr>
-            <w:tcW w:type="dxa" w:w="3552"/>
-            <w:tcMar>
-              <w:top w:type="dxa" w:w="40"/>
-              <w:left w:type="dxa" w:w="80"/>
-              <w:bottom w:type="dxa" w:w="40"/>
-              <w:right w:type="dxa" w:w="80"/>
-            </w:tcMar>
-            <w:vAlign w:val="center"/>
-          </w:tcPr>
-          <w:p>
-            <w:pPr>
-              <w:spacing w:after="0" w:before="0"/>
-              <w:jc w:val="right"/>
-            </w:pPr>
-            <w:r>
-              <w:rPr>
-                <w:rFonts w:ascii="맑은 고딕" w:cs="맑은 고딕" w:eastAsia="맑은 고딕" w:hAnsi="맑은 고딕"/>
-                <w:b w:val="false"/>
-                <w:bCs w:val="false"/>
-                <w:color w:val="2E2E2E"/>
-                <w:sz w:val="19"/>
-                <w:szCs w:val="19"/>
-              </w:rPr>
-              <w:t xml:space="preserve">설비 사업 통상 수준</w:t>
+            <w:tcW w:type="dxa" w:w="3400"/>
+            <w:tcMar>
+              <w:top w:type="dxa" w:w="40"/>
+              <w:left w:type="dxa" w:w="80"/>
+              <w:bottom w:type="dxa" w:w="40"/>
+              <w:right w:type="dxa" w:w="80"/>
+            </w:tcMar>
+            <w:vAlign w:val="center"/>
+          </w:tcPr>
+          <w:p>
+            <w:pPr>
+              <w:spacing w:after="0" w:before="0"/>
+              <w:jc w:val="left"/>
+            </w:pPr>
+            <w:r>
+              <w:rPr>
+                <w:rFonts w:ascii="맑은 고딕" w:cs="맑은 고딕" w:eastAsia="맑은 고딕" w:hAnsi="맑은 고딕"/>
+                <w:b w:val="false"/>
+                <w:bCs w:val="false"/>
+                <w:color w:val="2E2E2E"/>
+                <w:sz w:val="19"/>
+                <w:szCs w:val="19"/>
+              </w:rPr>
+              <w:t xml:space="preserve">마진</w:t>
+            </w:r>
+          </w:p>
+        </w:tc>
+        <w:tc>
+          <w:tcPr>
+            <w:tcW w:type="dxa" w:w="2600"/>
+            <w:tcMar>
+              <w:top w:type="dxa" w:w="40"/>
+              <w:left w:type="dxa" w:w="80"/>
+              <w:bottom w:type="dxa" w:w="40"/>
+              <w:right w:type="dxa" w:w="80"/>
+            </w:tcMar>
+            <w:vAlign w:val="center"/>
+          </w:tcPr>
+          <w:p>
+            <w:pPr>
+              <w:spacing w:after="0" w:before="0"/>
+              <w:jc w:val="left"/>
+            </w:pPr>
+            <w:r>
+              <w:rPr>
+                <w:rFonts w:ascii="맑은 고딕" w:cs="맑은 고딕" w:eastAsia="맑은 고딕" w:hAnsi="맑은 고딕"/>
+                <w:b w:val="false"/>
+                <w:bCs w:val="false"/>
+                <w:color w:val="2E2E2E"/>
+                <w:sz w:val="19"/>
+                <w:szCs w:val="19"/>
+              </w:rPr>
+              <w:t xml:space="preserve">11,000,000</w:t>
+            </w:r>
+          </w:p>
+        </w:tc>
+        <w:tc>
+          <w:tcPr>
+            <w:tcW w:type="dxa" w:w="3752"/>
+            <w:tcMar>
+              <w:top w:type="dxa" w:w="40"/>
+              <w:left w:type="dxa" w:w="80"/>
+              <w:bottom w:type="dxa" w:w="40"/>
+              <w:right w:type="dxa" w:w="80"/>
+            </w:tcMar>
+            <w:vAlign w:val="center"/>
+          </w:tcPr>
+          <w:p>
+            <w:pPr>
+              <w:spacing w:after="0" w:before="0"/>
+              <w:jc w:val="right"/>
+            </w:pPr>
+            <w:r>
+              <w:rPr>
+                <w:rFonts w:ascii="맑은 고딕" w:cs="맑은 고딕" w:eastAsia="맑은 고딕" w:hAnsi="맑은 고딕"/>
+                <w:b w:val="false"/>
+                <w:bCs w:val="false"/>
+                <w:color w:val="2E2E2E"/>
+                <w:sz w:val="19"/>
+                <w:szCs w:val="19"/>
+              </w:rPr>
+              <w:t xml:space="preserve">13.8% (설비 사업 최소 수준)</w:t>
             </w:r>
           </w:p>
         </w:tc>
@@ -9845,7 +10393,7 @@
       <w:tr>
         <w:tc>
           <w:tcPr>
-            <w:tcW w:type="dxa" w:w="3200"/>
+            <w:tcW w:type="dxa" w:w="3400"/>
             <w:shd w:fill="EDF2FA" w:val="clear"/>
             <w:tcMar>
               <w:top w:type="dxa" w:w="40"/>
@@ -9875,7 +10423,7 @@
         </w:tc>
         <w:tc>
           <w:tcPr>
-            <w:tcW w:type="dxa" w:w="3000"/>
+            <w:tcW w:type="dxa" w:w="2600"/>
             <w:shd w:fill="EDF2FA" w:val="clear"/>
             <w:tcMar>
               <w:top w:type="dxa" w:w="40"/>
@@ -9905,7 +10453,7 @@
         </w:tc>
         <w:tc>
           <w:tcPr>
-            <w:tcW w:type="dxa" w:w="3552"/>
+            <w:tcW w:type="dxa" w:w="3752"/>
             <w:shd w:fill="EDF2FA" w:val="clear"/>
             <w:tcMar>
               <w:top w:type="dxa" w:w="40"/>
@@ -9929,7 +10477,7 @@
                 <w:sz w:val="19"/>
                 <w:szCs w:val="19"/>
               </w:rPr>
-              <w:t xml:space="preserve">사전 협의 수준 반영</w:t>
+              <w:t xml:space="preserve">사전 협의 수준 충족</w:t>
             </w:r>
           </w:p>
         </w:tc>
@@ -10124,7 +10672,7 @@
                 <w:sz w:val="19"/>
                 <w:szCs w:val="19"/>
               </w:rPr>
-              <w:t xml:space="preserve">70,000,000</w:t>
+              <w:t xml:space="preserve">73,000,000</w:t>
             </w:r>
           </w:p>
         </w:tc>
@@ -10153,7 +10701,7 @@
                 <w:sz w:val="19"/>
                 <w:szCs w:val="19"/>
               </w:rPr>
-              <w:t xml:space="preserve">내부 거래 (마진 7.7%)</w:t>
+              <w:t xml:space="preserve">내부 거래 (마진 5.8%)</w:t>
             </w:r>
           </w:p>
         </w:tc>
@@ -10302,7 +10850,7 @@
                 <w:sz w:val="19"/>
                 <w:szCs w:val="19"/>
               </w:rPr>
-              <w:t xml:space="preserve">10,000,000</w:t>
+              <w:t xml:space="preserve">7,000,000</w:t>
             </w:r>
           </w:p>
         </w:tc>
@@ -10355,8 +10903,27 @@
           <w:sz w:val="21"/>
           <w:szCs w:val="21"/>
         </w:rPr>
-        <w:t xml:space="preserve">3-4. 2호기 이후 원가</w:t>
+        <w:t xml:space="preserve">3-4. 2호기 이후 원가 (수익성 회복 구간)</w:t>
       </w:r>
+    </w:p>
+    <w:p>
+      <w:pPr>
+        <w:spacing w:after="30" w:before="30"/>
+      </w:pPr>
+      <w:r>
+        <w:rPr>
+          <w:rFonts w:ascii="맑은 고딕" w:cs="맑은 고딕" w:eastAsia="맑은 고딕" w:hAnsi="맑은 고딕"/>
+          <w:color w:val="2E2E2E"/>
+          <w:sz w:val="20"/>
+          <w:szCs w:val="20"/>
+        </w:rPr>
+        <w:t xml:space="preserve">1호기는 마진이 낮으나, 2호기부터는 개발 라이선스·학습 데이터·설계 자산을 재활용하여 수익성이 크게 개선됩니다.</w:t>
+      </w:r>
+    </w:p>
+    <w:p>
+      <w:pPr>
+        <w:spacing w:after="0" w:before="0"/>
+      </w:pPr>
     </w:p>
     <w:tbl>
       <w:tblPr>
@@ -10557,7 +11124,7 @@
                 <w:sz w:val="19"/>
                 <w:szCs w:val="19"/>
               </w:rPr>
-              <w:t xml:space="preserve">14,500,000</w:t>
+              <w:t xml:space="preserve">35,000,000</w:t>
             </w:r>
           </w:p>
         </w:tc>
@@ -10586,7 +11153,7 @@
                 <w:sz w:val="19"/>
                 <w:szCs w:val="19"/>
               </w:rPr>
-              <w:t xml:space="preserve">7,500,000</w:t>
+              <w:t xml:space="preserve">15,000,000</w:t>
             </w:r>
           </w:p>
         </w:tc>
@@ -10615,7 +11182,7 @@
                 <w:sz w:val="19"/>
                 <w:szCs w:val="19"/>
               </w:rPr>
-              <w:t xml:space="preserve">개발 라이선스 재활용</w:t>
+              <w:t xml:space="preserve">개발 라이선스 재활용 (런타임만 신규)</w:t>
             </w:r>
           </w:p>
         </w:tc>
@@ -10675,7 +11242,7 @@
                 <w:sz w:val="19"/>
                 <w:szCs w:val="19"/>
               </w:rPr>
-              <w:t xml:space="preserve">7,500,000</w:t>
+              <w:t xml:space="preserve">7,000,000</w:t>
             </w:r>
           </w:p>
         </w:tc>
@@ -10704,7 +11271,7 @@
                 <w:sz w:val="19"/>
                 <w:szCs w:val="19"/>
               </w:rPr>
-              <w:t xml:space="preserve">7,500,000</w:t>
+              <w:t xml:space="preserve">7,000,000</w:t>
             </w:r>
           </w:p>
         </w:tc>
@@ -10793,7 +11360,7 @@
                 <w:sz w:val="19"/>
                 <w:szCs w:val="19"/>
               </w:rPr>
-              <w:t xml:space="preserve">13,000,000</w:t>
+              <w:t xml:space="preserve">10,500,000</w:t>
             </w:r>
           </w:p>
         </w:tc>
@@ -10822,7 +11389,7 @@
                 <w:sz w:val="19"/>
                 <w:szCs w:val="19"/>
               </w:rPr>
-              <w:t xml:space="preserve">11,000,000</w:t>
+              <w:t xml:space="preserve">9,000,000</w:t>
             </w:r>
           </w:p>
         </w:tc>
@@ -10851,7 +11418,7 @@
                 <w:sz w:val="19"/>
                 <w:szCs w:val="19"/>
               </w:rPr>
-              <w:t xml:space="preserve">설계 재사용</w:t>
+              <w:t xml:space="preserve">설계·도면 재사용</w:t>
             </w:r>
           </w:p>
         </w:tc>
@@ -10911,7 +11478,7 @@
                 <w:sz w:val="19"/>
                 <w:szCs w:val="19"/>
               </w:rPr>
-              <w:t xml:space="preserve">6,500,000</w:t>
+              <w:t xml:space="preserve">5,300,000</w:t>
             </w:r>
           </w:p>
         </w:tc>
@@ -10940,7 +11507,7 @@
                 <w:sz w:val="19"/>
                 <w:szCs w:val="19"/>
               </w:rPr>
-              <w:t xml:space="preserve">6,000,000</w:t>
+              <w:t xml:space="preserve">5,000,000</w:t>
             </w:r>
           </w:p>
         </w:tc>
@@ -11029,7 +11596,7 @@
                 <w:sz w:val="19"/>
                 <w:szCs w:val="19"/>
               </w:rPr>
-              <w:t xml:space="preserve">21,470,000</w:t>
+              <w:t xml:space="preserve">10,400,000</w:t>
             </w:r>
           </w:p>
         </w:tc>
@@ -11058,7 +11625,7 @@
                 <w:sz w:val="19"/>
                 <w:szCs w:val="19"/>
               </w:rPr>
-              <w:t xml:space="preserve">8,000,000</w:t>
+              <w:t xml:space="preserve">5,000,000</w:t>
             </w:r>
           </w:p>
         </w:tc>
@@ -11087,7 +11654,7 @@
                 <w:sz w:val="19"/>
                 <w:szCs w:val="19"/>
               </w:rPr>
-              <w:t xml:space="preserve">학습 데이터·모델 재활용</w:t>
+              <w:t xml:space="preserve">학습 모델 재활용</w:t>
             </w:r>
           </w:p>
         </w:tc>
@@ -11149,7 +11716,7 @@
                 <w:sz w:val="19"/>
                 <w:szCs w:val="19"/>
               </w:rPr>
-              <w:t xml:space="preserve">62,970,000</w:t>
+              <w:t xml:space="preserve">68,200,000</w:t>
             </w:r>
           </w:p>
         </w:tc>
@@ -11179,7 +11746,7 @@
                 <w:sz w:val="19"/>
                 <w:szCs w:val="19"/>
               </w:rPr>
-              <w:t xml:space="preserve">40,000,000</w:t>
+              <w:t xml:space="preserve">41,000,000</w:t>
             </w:r>
           </w:p>
         </w:tc>
@@ -11209,7 +11776,7 @@
                 <w:sz w:val="19"/>
                 <w:szCs w:val="19"/>
               </w:rPr>
-              <w:t xml:space="preserve">약 36% 절감</w:t>
+              <w:t xml:space="preserve">약 40% 절감</w:t>
             </w:r>
           </w:p>
         </w:tc>
@@ -11298,7 +11865,7 @@
                 <w:sz w:val="19"/>
                 <w:szCs w:val="19"/>
               </w:rPr>
-              <w:t xml:space="preserve">55,000,000</w:t>
+              <w:t xml:space="preserve">60,000,000</w:t>
             </w:r>
           </w:p>
         </w:tc>
@@ -11327,7 +11894,7 @@
                 <w:sz w:val="19"/>
                 <w:szCs w:val="19"/>
               </w:rPr>
-              <w:t xml:space="preserve">2호기 이후 가격 경쟁력 확보</w:t>
+              <w:t xml:space="preserve">마진 31.7% 확보</w:t>
             </w:r>
           </w:p>
         </w:tc>
@@ -11805,7 +12372,7 @@
                 <w:sz w:val="19"/>
                 <w:szCs w:val="19"/>
               </w:rPr>
-              <w:t xml:space="preserve">연간 유지보수 (SMA)</w:t>
+              <w:t xml:space="preserve">연간 유지보수 (SMA, 라이선스가의 10%)</w:t>
             </w:r>
           </w:p>
         </w:tc>
@@ -11863,7 +12430,7 @@
                 <w:sz w:val="19"/>
                 <w:szCs w:val="19"/>
               </w:rPr>
-              <w:t xml:space="preserve">1,500,000</w:t>
+              <w:t xml:space="preserve">2,900,000</w:t>
             </w:r>
           </w:p>
         </w:tc>
@@ -12217,7 +12784,7 @@
                 <w:sz w:val="19"/>
                 <w:szCs w:val="19"/>
               </w:rPr>
-              <w:t xml:space="preserve">700,000</w:t>
+              <w:t xml:space="preserve">800,000</w:t>
             </w:r>
           </w:p>
         </w:tc>
@@ -12339,7 +12906,7 @@
                 <w:sz w:val="19"/>
                 <w:szCs w:val="19"/>
               </w:rPr>
-              <w:t xml:space="preserve">9,000,000</w:t>
+              <w:t xml:space="preserve">10,500,000</w:t>
             </w:r>
           </w:p>
         </w:tc>
@@ -12534,7 +13101,7 @@
                 <w:sz w:val="19"/>
                 <w:szCs w:val="19"/>
               </w:rPr>
-              <w:t xml:space="preserve">5,500,000</w:t>
+              <w:t xml:space="preserve">6,500,000</w:t>
             </w:r>
           </w:p>
         </w:tc>
@@ -12563,7 +13130,7 @@
                 <w:sz w:val="19"/>
                 <w:szCs w:val="19"/>
               </w:rPr>
-              <w:t xml:space="preserve">정기 점검, 원격 지원, 소모품 일부</w:t>
+              <w:t xml:space="preserve">정기 점검, 원격 지원, 라이선스 갱신</w:t>
             </w:r>
           </w:p>
         </w:tc>
@@ -12623,7 +13190,7 @@
                 <w:sz w:val="19"/>
                 <w:szCs w:val="19"/>
               </w:rPr>
-              <w:t xml:space="preserve">9,000,000</w:t>
+              <w:t xml:space="preserve">10,500,000</w:t>
             </w:r>
           </w:p>
         </w:tc>
@@ -12712,7 +13279,7 @@
                 <w:sz w:val="19"/>
                 <w:szCs w:val="19"/>
               </w:rPr>
-              <w:t xml:space="preserve">13,000,000</w:t>
+              <w:t xml:space="preserve">15,000,000</w:t>
             </w:r>
           </w:p>
         </w:tc>
@@ -12761,7 +13328,7 @@
           <w:sz w:val="18"/>
           <w:szCs w:val="18"/>
         </w:rPr>
-        <w:t xml:space="preserve">※ 무상 보증 12개월, 유지관리 계약은 13개월차부터 적용. 판매가 대비 11.3% 수준(업계 통상 8~15%).</w:t>
+        <w:t xml:space="preserve">※ 무상 보증 12개월, 유지관리 계약은 13개월차부터 적용. 판매가 대비 13.1% 수준.</w:t>
       </w:r>
     </w:p>
     <w:p>
@@ -12798,7 +13365,7 @@
           <w:sz w:val="21"/>
           <w:szCs w:val="21"/>
         </w:rPr>
-        <w:t xml:space="preserve">5-1. 위너콤 관점</w:t>
+        <w:t xml:space="preserve">5-1. 위너콤 관점 (구매 방식)</w:t>
       </w:r>
     </w:p>
     <w:tbl>
@@ -12998,7 +13565,7 @@
                 <w:sz w:val="19"/>
                 <w:szCs w:val="19"/>
               </w:rPr>
-              <w:t xml:space="preserve">일시 구매 시</w:t>
+              <w:t xml:space="preserve">일시 구매</w:t>
             </w:r>
           </w:p>
         </w:tc>
@@ -13058,7 +13625,7 @@
                 <w:sz w:val="19"/>
                 <w:szCs w:val="19"/>
               </w:rPr>
-              <w:t xml:space="preserve">9,000,000</w:t>
+              <w:t xml:space="preserve">10,500,000</w:t>
             </w:r>
           </w:p>
         </w:tc>
@@ -13236,7 +13803,7 @@
                 <w:sz w:val="19"/>
                 <w:szCs w:val="19"/>
               </w:rPr>
-              <w:t xml:space="preserve">75,000,000</w:t>
+              <w:t xml:space="preserve">73,500,000</w:t>
             </w:r>
           </w:p>
         </w:tc>
@@ -13357,7 +13924,7 @@
                 <w:sz w:val="19"/>
                 <w:szCs w:val="19"/>
               </w:rPr>
-              <w:t xml:space="preserve">80,000,000 ÷ 75,000,000</w:t>
+              <w:t xml:space="preserve">80,000,000 ÷ 73,500,000</w:t>
             </w:r>
           </w:p>
         </w:tc>
@@ -13552,7 +14119,7 @@
                 <w:sz w:val="19"/>
                 <w:szCs w:val="19"/>
               </w:rPr>
-              <w:t xml:space="preserve">70,000,000</w:t>
+              <w:t xml:space="preserve">73,000,000</w:t>
             </w:r>
           </w:p>
         </w:tc>
@@ -13641,7 +14208,7 @@
                 <w:sz w:val="19"/>
                 <w:szCs w:val="19"/>
               </w:rPr>
-              <w:t xml:space="preserve">2,500,000</w:t>
+              <w:t xml:space="preserve">2,800,000</w:t>
             </w:r>
           </w:p>
         </w:tc>
@@ -13730,7 +14297,7 @@
                 <w:sz w:val="19"/>
                 <w:szCs w:val="19"/>
               </w:rPr>
-              <w:t xml:space="preserve">30,000,000</w:t>
+              <w:t xml:space="preserve">33,600,000</w:t>
             </w:r>
           </w:p>
         </w:tc>
@@ -13819,7 +14386,7 @@
                 <w:sz w:val="19"/>
                 <w:szCs w:val="19"/>
               </w:rPr>
-              <w:t xml:space="preserve">9,000,000</w:t>
+              <w:t xml:space="preserve">10,500,000</w:t>
             </w:r>
           </w:p>
         </w:tc>
@@ -13908,7 +14475,7 @@
                 <w:sz w:val="19"/>
                 <w:szCs w:val="19"/>
               </w:rPr>
-              <w:t xml:space="preserve">21,000,000</w:t>
+              <w:t xml:space="preserve">23,100,000</w:t>
             </w:r>
           </w:p>
         </w:tc>
@@ -13999,7 +14566,7 @@
                 <w:sz w:val="19"/>
                 <w:szCs w:val="19"/>
               </w:rPr>
-              <w:t xml:space="preserve">약 3.3년</w:t>
+              <w:t xml:space="preserve">약 3.2년</w:t>
             </w:r>
           </w:p>
         </w:tc>
@@ -14049,7 +14616,7 @@
           <w:sz w:val="18"/>
           <w:szCs w:val="18"/>
         </w:rPr>
-        <w:t xml:space="preserve">※ 위너콤 관점에서는 월 250만원 임대료가 검사원 2명(월 700만원) 대비 월 450만원 절감 효과.</w:t>
+        <w:t xml:space="preserve">※ 위너콤 관점: 월 280만원 임대료 vs 검사원 2명 월 700만원 → 월 420만원 절감.</w:t>
       </w:r>
     </w:p>
     <w:p>
@@ -14070,7 +14637,23 @@
           <w:sz w:val="24"/>
           <w:szCs w:val="24"/>
         </w:rPr>
-        <w:t xml:space="preserve">6. 전제 조건 및 유의사항</w:t>
+        <w:t xml:space="preserve">6. 전제 조건 및 리스크</w:t>
+      </w:r>
+    </w:p>
+    <w:p>
+      <w:pPr>
+        <w:spacing w:after="50" w:before="140"/>
+      </w:pPr>
+      <w:r>
+        <w:rPr>
+          <w:rFonts w:ascii="맑은 고딕" w:cs="맑은 고딕" w:eastAsia="맑은 고딕" w:hAnsi="맑은 고딕"/>
+          <w:b/>
+          <w:bCs/>
+          <w:color w:val="2E4D8A"/>
+          <w:sz w:val="21"/>
+          <w:szCs w:val="21"/>
+        </w:rPr>
+        <w:t xml:space="preserve">6-1. 원가 달성 전제</w:t>
       </w:r>
     </w:p>
     <w:p>
@@ -14085,7 +14668,7 @@
           <w:sz w:val="20"/>
           <w:szCs w:val="20"/>
         </w:rPr>
-        <w:t xml:space="preserve">· 본 산출서는 현장 실사 이전의 사전 검토용이며, 실제 사양 확정 시 ±10% 범위 변동 가능</w:t>
+        <w:t xml:space="preserve">· 개발 공수 29 M/D 달성을 위해 협력사 기보유 기술 자산 재활용이 필수</w:t>
       </w:r>
     </w:p>
     <w:p>
@@ -14100,7 +14683,7 @@
           <w:sz w:val="20"/>
           <w:szCs w:val="20"/>
         </w:rPr>
-        <w:t xml:space="preserve">· 컨베어 직선 통과형, 단일 검사 스테이션, 상부 카메라 1대 기준으로 산정</w:t>
+        <w:t xml:space="preserve">· 위너콤의 불량 이미지·판정 이력 데이터 사전 제공 (미제공 시 인건비 300~500만원 증가)</w:t>
       </w:r>
     </w:p>
     <w:p>
@@ -14115,7 +14698,7 @@
           <w:sz w:val="20"/>
           <w:szCs w:val="20"/>
         </w:rPr>
-        <w:t xml:space="preserve">· 지그 자동 리턴 구조 추가 시 기구비 약 500~800만원 증가 예상</w:t>
+        <w:t xml:space="preserve">· 검사 항목 5종 한정 (추가 시 항목당 약 150만원 증가)</w:t>
       </w:r>
     </w:p>
     <w:p>
@@ -14130,37 +14713,520 @@
           <w:sz w:val="20"/>
           <w:szCs w:val="20"/>
         </w:rPr>
-        <w:t xml:space="preserve">· 다수 동시 안착 구조 적용 시 기구·제어비 약 400~700만원 증가 예상</w:t>
+        <w:t xml:space="preserve">· 컨베어 직선 통과형, 단일 검사 스테이션, 상부 카메라 1대 구성 기준</w:t>
       </w:r>
     </w:p>
     <w:p>
       <w:pPr>
-        <w:spacing w:after="20" w:before="20"/>
-        <w:ind w:left="280"/>
+        <w:spacing w:after="0" w:before="0"/>
+      </w:pPr>
+    </w:p>
+    <w:p>
+      <w:pPr>
+        <w:spacing w:after="50" w:before="140"/>
       </w:pPr>
       <w:r>
         <w:rPr>
           <w:rFonts w:ascii="맑은 고딕" w:cs="맑은 고딕" w:eastAsia="맑은 고딕" w:hAnsi="맑은 고딕"/>
-          <w:color w:val="2E2E2E"/>
-          <w:sz w:val="20"/>
-          <w:szCs w:val="20"/>
+          <w:b/>
+          <w:bCs/>
+          <w:color w:val="2E4D8A"/>
+          <w:sz w:val="21"/>
+          <w:szCs w:val="21"/>
         </w:rPr>
-        <w:t xml:space="preserve">· 기존 육안검사 불량 데이터 제공 시 개발 인건비 약 300~500만원 절감 가능</w:t>
+        <w:t xml:space="preserve">6-2. 원가 상승 리스크</w:t>
       </w:r>
+    </w:p>
+    <w:tbl>
+      <w:tblPr>
+        <w:tblW w:type="dxa" w:w="9752"/>
+        <w:tblBorders>
+          <w:top w:val="single" w:color="A0B4D0" w:sz="6"/>
+          <w:left w:val="single" w:color="A0B4D0" w:sz="6"/>
+          <w:bottom w:val="single" w:color="A0B4D0" w:sz="6"/>
+          <w:right w:val="single" w:color="A0B4D0" w:sz="6"/>
+          <w:insideH w:val="single" w:color="auto" w:sz="4"/>
+          <w:insideV w:val="single" w:color="auto" w:sz="4"/>
+        </w:tblBorders>
+        <w:tblLayout w:type="fixed"/>
+      </w:tblPr>
+      <w:tblGrid>
+        <w:gridCol w:w="100"/>
+        <w:gridCol w:w="100"/>
+        <w:gridCol w:w="100"/>
+      </w:tblGrid>
+      <w:tr>
+        <w:trPr>
+          <w:tblHeader/>
+        </w:trPr>
+        <w:tc>
+          <w:tcPr>
+            <w:tcW w:type="dxa" w:w="3200"/>
+            <w:shd w:fill="D9E2F3" w:val="clear"/>
+            <w:tcMar>
+              <w:top w:type="dxa" w:w="40"/>
+              <w:left w:type="dxa" w:w="80"/>
+              <w:bottom w:type="dxa" w:w="40"/>
+              <w:right w:type="dxa" w:w="80"/>
+            </w:tcMar>
+            <w:vAlign w:val="center"/>
+          </w:tcPr>
+          <w:p>
+            <w:pPr>
+              <w:spacing w:after="0" w:before="0"/>
+              <w:jc w:val="center"/>
+            </w:pPr>
+            <w:r>
+              <w:rPr>
+                <w:rFonts w:ascii="맑은 고딕" w:cs="맑은 고딕" w:eastAsia="맑은 고딕" w:hAnsi="맑은 고딕"/>
+                <w:b/>
+                <w:bCs/>
+                <w:color w:val="1F3864"/>
+                <w:sz w:val="19"/>
+                <w:szCs w:val="19"/>
+              </w:rPr>
+              <w:t xml:space="preserve">항목</w:t>
+            </w:r>
+          </w:p>
+        </w:tc>
+        <w:tc>
+          <w:tcPr>
+            <w:tcW w:type="dxa" w:w="2600"/>
+            <w:shd w:fill="D9E2F3" w:val="clear"/>
+            <w:tcMar>
+              <w:top w:type="dxa" w:w="40"/>
+              <w:left w:type="dxa" w:w="80"/>
+              <w:bottom w:type="dxa" w:w="40"/>
+              <w:right w:type="dxa" w:w="80"/>
+            </w:tcMar>
+            <w:vAlign w:val="center"/>
+          </w:tcPr>
+          <w:p>
+            <w:pPr>
+              <w:spacing w:after="0" w:before="0"/>
+              <w:jc w:val="center"/>
+            </w:pPr>
+            <w:r>
+              <w:rPr>
+                <w:rFonts w:ascii="맑은 고딕" w:cs="맑은 고딕" w:eastAsia="맑은 고딕" w:hAnsi="맑은 고딕"/>
+                <w:b/>
+                <w:bCs/>
+                <w:color w:val="1F3864"/>
+                <w:sz w:val="19"/>
+                <w:szCs w:val="19"/>
+              </w:rPr>
+              <w:t xml:space="preserve">증가 예상액(원)</w:t>
+            </w:r>
+          </w:p>
+        </w:tc>
+        <w:tc>
+          <w:tcPr>
+            <w:tcW w:type="dxa" w:w="3952"/>
+            <w:shd w:fill="D9E2F3" w:val="clear"/>
+            <w:tcMar>
+              <w:top w:type="dxa" w:w="40"/>
+              <w:left w:type="dxa" w:w="80"/>
+              <w:bottom w:type="dxa" w:w="40"/>
+              <w:right w:type="dxa" w:w="80"/>
+            </w:tcMar>
+            <w:vAlign w:val="center"/>
+          </w:tcPr>
+          <w:p>
+            <w:pPr>
+              <w:spacing w:after="0" w:before="0"/>
+              <w:jc w:val="center"/>
+            </w:pPr>
+            <w:r>
+              <w:rPr>
+                <w:rFonts w:ascii="맑은 고딕" w:cs="맑은 고딕" w:eastAsia="맑은 고딕" w:hAnsi="맑은 고딕"/>
+                <w:b/>
+                <w:bCs/>
+                <w:color w:val="1F3864"/>
+                <w:sz w:val="19"/>
+                <w:szCs w:val="19"/>
+              </w:rPr>
+              <w:t xml:space="preserve">조건</w:t>
+            </w:r>
+          </w:p>
+        </w:tc>
+      </w:tr>
+      <w:tr>
+        <w:tc>
+          <w:tcPr>
+            <w:tcW w:type="dxa" w:w="3200"/>
+            <w:tcMar>
+              <w:top w:type="dxa" w:w="40"/>
+              <w:left w:type="dxa" w:w="80"/>
+              <w:bottom w:type="dxa" w:w="40"/>
+              <w:right w:type="dxa" w:w="80"/>
+            </w:tcMar>
+            <w:vAlign w:val="center"/>
+          </w:tcPr>
+          <w:p>
+            <w:pPr>
+              <w:spacing w:after="0" w:before="0"/>
+              <w:jc w:val="left"/>
+            </w:pPr>
+            <w:r>
+              <w:rPr>
+                <w:rFonts w:ascii="맑은 고딕" w:cs="맑은 고딕" w:eastAsia="맑은 고딕" w:hAnsi="맑은 고딕"/>
+                <w:b w:val="false"/>
+                <w:bCs w:val="false"/>
+                <w:color w:val="2E2E2E"/>
+                <w:sz w:val="19"/>
+                <w:szCs w:val="19"/>
+              </w:rPr>
+              <w:t xml:space="preserve">지그 자동 리턴 구조 추가</w:t>
+            </w:r>
+          </w:p>
+        </w:tc>
+        <w:tc>
+          <w:tcPr>
+            <w:tcW w:type="dxa" w:w="2600"/>
+            <w:tcMar>
+              <w:top w:type="dxa" w:w="40"/>
+              <w:left w:type="dxa" w:w="80"/>
+              <w:bottom w:type="dxa" w:w="40"/>
+              <w:right w:type="dxa" w:w="80"/>
+            </w:tcMar>
+            <w:vAlign w:val="center"/>
+          </w:tcPr>
+          <w:p>
+            <w:pPr>
+              <w:spacing w:after="0" w:before="0"/>
+              <w:jc w:val="left"/>
+            </w:pPr>
+            <w:r>
+              <w:rPr>
+                <w:rFonts w:ascii="맑은 고딕" w:cs="맑은 고딕" w:eastAsia="맑은 고딕" w:hAnsi="맑은 고딕"/>
+                <w:b w:val="false"/>
+                <w:bCs w:val="false"/>
+                <w:color w:val="2E2E2E"/>
+                <w:sz w:val="19"/>
+                <w:szCs w:val="19"/>
+              </w:rPr>
+              <w:t xml:space="preserve">+5,000,000 ~ 8,000,000</w:t>
+            </w:r>
+          </w:p>
+        </w:tc>
+        <w:tc>
+          <w:tcPr>
+            <w:tcW w:type="dxa" w:w="3952"/>
+            <w:tcMar>
+              <w:top w:type="dxa" w:w="40"/>
+              <w:left w:type="dxa" w:w="80"/>
+              <w:bottom w:type="dxa" w:w="40"/>
+              <w:right w:type="dxa" w:w="80"/>
+            </w:tcMar>
+            <w:vAlign w:val="center"/>
+          </w:tcPr>
+          <w:p>
+            <w:pPr>
+              <w:spacing w:after="0" w:before="0"/>
+              <w:jc w:val="right"/>
+            </w:pPr>
+            <w:r>
+              <w:rPr>
+                <w:rFonts w:ascii="맑은 고딕" w:cs="맑은 고딕" w:eastAsia="맑은 고딕" w:hAnsi="맑은 고딕"/>
+                <w:b w:val="false"/>
+                <w:bCs w:val="false"/>
+                <w:color w:val="2E2E2E"/>
+                <w:sz w:val="19"/>
+                <w:szCs w:val="19"/>
+              </w:rPr>
+              <w:t xml:space="preserve">지그 회수 자동화 요구 시</w:t>
+            </w:r>
+          </w:p>
+        </w:tc>
+      </w:tr>
+      <w:tr>
+        <w:tc>
+          <w:tcPr>
+            <w:tcW w:type="dxa" w:w="3200"/>
+            <w:tcMar>
+              <w:top w:type="dxa" w:w="40"/>
+              <w:left w:type="dxa" w:w="80"/>
+              <w:bottom w:type="dxa" w:w="40"/>
+              <w:right w:type="dxa" w:w="80"/>
+            </w:tcMar>
+            <w:vAlign w:val="center"/>
+          </w:tcPr>
+          <w:p>
+            <w:pPr>
+              <w:spacing w:after="0" w:before="0"/>
+              <w:jc w:val="left"/>
+            </w:pPr>
+            <w:r>
+              <w:rPr>
+                <w:rFonts w:ascii="맑은 고딕" w:cs="맑은 고딕" w:eastAsia="맑은 고딕" w:hAnsi="맑은 고딕"/>
+                <w:b w:val="false"/>
+                <w:bCs w:val="false"/>
+                <w:color w:val="2E2E2E"/>
+                <w:sz w:val="19"/>
+                <w:szCs w:val="19"/>
+              </w:rPr>
+              <w:t xml:space="preserve">다수 동시 안착 구조</w:t>
+            </w:r>
+          </w:p>
+        </w:tc>
+        <w:tc>
+          <w:tcPr>
+            <w:tcW w:type="dxa" w:w="2600"/>
+            <w:tcMar>
+              <w:top w:type="dxa" w:w="40"/>
+              <w:left w:type="dxa" w:w="80"/>
+              <w:bottom w:type="dxa" w:w="40"/>
+              <w:right w:type="dxa" w:w="80"/>
+            </w:tcMar>
+            <w:vAlign w:val="center"/>
+          </w:tcPr>
+          <w:p>
+            <w:pPr>
+              <w:spacing w:after="0" w:before="0"/>
+              <w:jc w:val="left"/>
+            </w:pPr>
+            <w:r>
+              <w:rPr>
+                <w:rFonts w:ascii="맑은 고딕" w:cs="맑은 고딕" w:eastAsia="맑은 고딕" w:hAnsi="맑은 고딕"/>
+                <w:b w:val="false"/>
+                <w:bCs w:val="false"/>
+                <w:color w:val="2E2E2E"/>
+                <w:sz w:val="19"/>
+                <w:szCs w:val="19"/>
+              </w:rPr>
+              <w:t xml:space="preserve">+4,000,000 ~ 7,000,000</w:t>
+            </w:r>
+          </w:p>
+        </w:tc>
+        <w:tc>
+          <w:tcPr>
+            <w:tcW w:type="dxa" w:w="3952"/>
+            <w:tcMar>
+              <w:top w:type="dxa" w:w="40"/>
+              <w:left w:type="dxa" w:w="80"/>
+              <w:bottom w:type="dxa" w:w="40"/>
+              <w:right w:type="dxa" w:w="80"/>
+            </w:tcMar>
+            <w:vAlign w:val="center"/>
+          </w:tcPr>
+          <w:p>
+            <w:pPr>
+              <w:spacing w:after="0" w:before="0"/>
+              <w:jc w:val="right"/>
+            </w:pPr>
+            <w:r>
+              <w:rPr>
+                <w:rFonts w:ascii="맑은 고딕" w:cs="맑은 고딕" w:eastAsia="맑은 고딕" w:hAnsi="맑은 고딕"/>
+                <w:b w:val="false"/>
+                <w:bCs w:val="false"/>
+                <w:color w:val="2E2E2E"/>
+                <w:sz w:val="19"/>
+                <w:szCs w:val="19"/>
+              </w:rPr>
+              <w:t xml:space="preserve">멀티 안착 요구 시</w:t>
+            </w:r>
+          </w:p>
+        </w:tc>
+      </w:tr>
+      <w:tr>
+        <w:tc>
+          <w:tcPr>
+            <w:tcW w:type="dxa" w:w="3200"/>
+            <w:tcMar>
+              <w:top w:type="dxa" w:w="40"/>
+              <w:left w:type="dxa" w:w="80"/>
+              <w:bottom w:type="dxa" w:w="40"/>
+              <w:right w:type="dxa" w:w="80"/>
+            </w:tcMar>
+            <w:vAlign w:val="center"/>
+          </w:tcPr>
+          <w:p>
+            <w:pPr>
+              <w:spacing w:after="0" w:before="0"/>
+              <w:jc w:val="left"/>
+            </w:pPr>
+            <w:r>
+              <w:rPr>
+                <w:rFonts w:ascii="맑은 고딕" w:cs="맑은 고딕" w:eastAsia="맑은 고딕" w:hAnsi="맑은 고딕"/>
+                <w:b w:val="false"/>
+                <w:bCs w:val="false"/>
+                <w:color w:val="2E2E2E"/>
+                <w:sz w:val="19"/>
+                <w:szCs w:val="19"/>
+              </w:rPr>
+              <w:t xml:space="preserve">검사 항목 추가</w:t>
+            </w:r>
+          </w:p>
+        </w:tc>
+        <w:tc>
+          <w:tcPr>
+            <w:tcW w:type="dxa" w:w="2600"/>
+            <w:tcMar>
+              <w:top w:type="dxa" w:w="40"/>
+              <w:left w:type="dxa" w:w="80"/>
+              <w:bottom w:type="dxa" w:w="40"/>
+              <w:right w:type="dxa" w:w="80"/>
+            </w:tcMar>
+            <w:vAlign w:val="center"/>
+          </w:tcPr>
+          <w:p>
+            <w:pPr>
+              <w:spacing w:after="0" w:before="0"/>
+              <w:jc w:val="left"/>
+            </w:pPr>
+            <w:r>
+              <w:rPr>
+                <w:rFonts w:ascii="맑은 고딕" w:cs="맑은 고딕" w:eastAsia="맑은 고딕" w:hAnsi="맑은 고딕"/>
+                <w:b w:val="false"/>
+                <w:bCs w:val="false"/>
+                <w:color w:val="2E2E2E"/>
+                <w:sz w:val="19"/>
+                <w:szCs w:val="19"/>
+              </w:rPr>
+              <w:t xml:space="preserve">+1,500,000 / 항목</w:t>
+            </w:r>
+          </w:p>
+        </w:tc>
+        <w:tc>
+          <w:tcPr>
+            <w:tcW w:type="dxa" w:w="3952"/>
+            <w:tcMar>
+              <w:top w:type="dxa" w:w="40"/>
+              <w:left w:type="dxa" w:w="80"/>
+              <w:bottom w:type="dxa" w:w="40"/>
+              <w:right w:type="dxa" w:w="80"/>
+            </w:tcMar>
+            <w:vAlign w:val="center"/>
+          </w:tcPr>
+          <w:p>
+            <w:pPr>
+              <w:spacing w:after="0" w:before="0"/>
+              <w:jc w:val="right"/>
+            </w:pPr>
+            <w:r>
+              <w:rPr>
+                <w:rFonts w:ascii="맑은 고딕" w:cs="맑은 고딕" w:eastAsia="맑은 고딕" w:hAnsi="맑은 고딕"/>
+                <w:b w:val="false"/>
+                <w:bCs w:val="false"/>
+                <w:color w:val="2E2E2E"/>
+                <w:sz w:val="19"/>
+                <w:szCs w:val="19"/>
+              </w:rPr>
+              <w:t xml:space="preserve">5종 초과 시</w:t>
+            </w:r>
+          </w:p>
+        </w:tc>
+      </w:tr>
+      <w:tr>
+        <w:tc>
+          <w:tcPr>
+            <w:tcW w:type="dxa" w:w="3200"/>
+            <w:tcMar>
+              <w:top w:type="dxa" w:w="40"/>
+              <w:left w:type="dxa" w:w="80"/>
+              <w:bottom w:type="dxa" w:w="40"/>
+              <w:right w:type="dxa" w:w="80"/>
+            </w:tcMar>
+            <w:vAlign w:val="center"/>
+          </w:tcPr>
+          <w:p>
+            <w:pPr>
+              <w:spacing w:after="0" w:before="0"/>
+              <w:jc w:val="left"/>
+            </w:pPr>
+            <w:r>
+              <w:rPr>
+                <w:rFonts w:ascii="맑은 고딕" w:cs="맑은 고딕" w:eastAsia="맑은 고딕" w:hAnsi="맑은 고딕"/>
+                <w:b w:val="false"/>
+                <w:bCs w:val="false"/>
+                <w:color w:val="2E2E2E"/>
+                <w:sz w:val="19"/>
+                <w:szCs w:val="19"/>
+              </w:rPr>
+              <w:t xml:space="preserve">학습 데이터 미제공</w:t>
+            </w:r>
+          </w:p>
+        </w:tc>
+        <w:tc>
+          <w:tcPr>
+            <w:tcW w:type="dxa" w:w="2600"/>
+            <w:tcMar>
+              <w:top w:type="dxa" w:w="40"/>
+              <w:left w:type="dxa" w:w="80"/>
+              <w:bottom w:type="dxa" w:w="40"/>
+              <w:right w:type="dxa" w:w="80"/>
+            </w:tcMar>
+            <w:vAlign w:val="center"/>
+          </w:tcPr>
+          <w:p>
+            <w:pPr>
+              <w:spacing w:after="0" w:before="0"/>
+              <w:jc w:val="left"/>
+            </w:pPr>
+            <w:r>
+              <w:rPr>
+                <w:rFonts w:ascii="맑은 고딕" w:cs="맑은 고딕" w:eastAsia="맑은 고딕" w:hAnsi="맑은 고딕"/>
+                <w:b w:val="false"/>
+                <w:bCs w:val="false"/>
+                <w:color w:val="2E2E2E"/>
+                <w:sz w:val="19"/>
+                <w:szCs w:val="19"/>
+              </w:rPr>
+              <w:t xml:space="preserve">+3,000,000 ~ 5,000,000</w:t>
+            </w:r>
+          </w:p>
+        </w:tc>
+        <w:tc>
+          <w:tcPr>
+            <w:tcW w:type="dxa" w:w="3952"/>
+            <w:tcMar>
+              <w:top w:type="dxa" w:w="40"/>
+              <w:left w:type="dxa" w:w="80"/>
+              <w:bottom w:type="dxa" w:w="40"/>
+              <w:right w:type="dxa" w:w="80"/>
+            </w:tcMar>
+            <w:vAlign w:val="center"/>
+          </w:tcPr>
+          <w:p>
+            <w:pPr>
+              <w:spacing w:after="0" w:before="0"/>
+              <w:jc w:val="right"/>
+            </w:pPr>
+            <w:r>
+              <w:rPr>
+                <w:rFonts w:ascii="맑은 고딕" w:cs="맑은 고딕" w:eastAsia="맑은 고딕" w:hAnsi="맑은 고딕"/>
+                <w:b w:val="false"/>
+                <w:bCs w:val="false"/>
+                <w:color w:val="2E2E2E"/>
+                <w:sz w:val="19"/>
+                <w:szCs w:val="19"/>
+              </w:rPr>
+              <w:t xml:space="preserve">데이터 자체 수집 필요 시</w:t>
+            </w:r>
+          </w:p>
+        </w:tc>
+      </w:tr>
+    </w:tbl>
+    <w:p>
+      <w:pPr>
+        <w:spacing w:after="0" w:before="0"/>
+      </w:pPr>
     </w:p>
     <w:p>
       <w:pPr>
-        <w:spacing w:after="20" w:before="20"/>
-        <w:ind w:left="280"/>
+        <w:spacing w:after="40" w:before="40"/>
+        <w:ind w:left="200"/>
       </w:pPr>
       <w:r>
         <w:rPr>
           <w:rFonts w:ascii="맑은 고딕" w:cs="맑은 고딕" w:eastAsia="맑은 고딕" w:hAnsi="맑은 고딕"/>
-          <w:color w:val="2E2E2E"/>
-          <w:sz w:val="20"/>
-          <w:szCs w:val="20"/>
+          <w:b/>
+          <w:bCs/>
+          <w:color w:val="B91C1C"/>
+          <w:sz w:val="19"/>
+          <w:szCs w:val="19"/>
         </w:rPr>
-        <w:t xml:space="preserve">· 설치 부대공사(전기 인입, 에어 배관 등)는 위너콤 부담 또는 별도 산정</w:t>
+        <w:t xml:space="preserve">※ 상기 리스크 발생 시 판매가 8,000만원 유지가 어려우므로, 현장 실사 단계에서 사양을 명확히 확정해야 합니다.</w:t>
       </w:r>
     </w:p>
     <w:p>
@@ -14257,7 +15323,7 @@
         <w:sz w:val="16"/>
         <w:szCs w:val="16"/>
       </w:rPr>
-      <w:t xml:space="preserve">© 2026 인시스 AI혁신 R&amp;D센터  |  개발비용 산출서 v2.0</w:t>
+      <w:t xml:space="preserve">© 2026 인시스 AI혁신 R&amp;D센터  |  개발비용 산출서 v3.0</w:t>
     </w:r>
   </w:p>
 </w:ftr>

</xml_diff>

<commit_message>
Update cost_report.docx - dept name to 연구개발실
</commit_message>
<xml_diff>
--- a/cost_report.docx
+++ b/cost_report.docx
@@ -252,7 +252,7 @@
                 <w:sz w:val="19"/>
                 <w:szCs w:val="19"/>
               </w:rPr>
-              <w:t xml:space="preserve">인시스 AI혁신 R&amp;D센터</w:t>
+              <w:t xml:space="preserve">인시스 AI혁신 연구개발실</w:t>
             </w:r>
           </w:p>
         </w:tc>
@@ -11545,7 +11545,7 @@
         <w:sz w:val="16"/>
         <w:szCs w:val="16"/>
       </w:rPr>
-      <w:t xml:space="preserve">© 2026 인시스 AI혁신 R&amp;D센터  |  개발비용 산출서 v4.0 (검증 전용)</w:t>
+      <w:t xml:space="preserve">© 2026 인시스 AI혁신 연구개발실  |  개발비용 산출서 v4.0 (검증 전용)</w:t>
     </w:r>
   </w:p>
 </w:ftr>
@@ -11602,7 +11602,7 @@
         <w:sz w:val="17"/>
         <w:szCs w:val="17"/>
       </w:rPr>
-      <w:t xml:space="preserve">인시스 AI혁신 R&amp;D센터 | 대외비</w:t>
+      <w:t xml:space="preserve">인시스 AI혁신 연구개발실 | 대외비</w:t>
     </w:r>
   </w:p>
 </w:hdr>

</xml_diff>